<commit_message>
docs: Update final project report and references
</commit_message>
<xml_diff>
--- a/docs/FINAL_PROJECT_REPORT.docx
+++ b/docs/FINAL_PROJECT_REPORT.docx
@@ -32,7 +32,10 @@
         <w:t>University:</w:t>
       </w:r>
       <w:r>
-        <w:t xml:space="preserve"> [University name]</w:t>
+        <w:t xml:space="preserve"> </w:t>
+      </w:r>
+      <w:r>
+        <w:t>Vellore Institute of Technology, Vellore</w:t>
       </w:r>
     </w:p>
     <w:p>
@@ -46,21 +49,35 @@
         <w:t>Department:</w:t>
       </w:r>
       <w:r>
-        <w:t xml:space="preserve"> [Department name]</w:t>
+        <w:t xml:space="preserve"> </w:t>
+      </w:r>
+      <w:r>
+        <w:t>School of Computer Science and Engineering</w:t>
       </w:r>
     </w:p>
     <w:p>
       <w:pPr>
         <w:jc w:val="center"/>
       </w:pPr>
+      <w:proofErr w:type="spellStart"/>
       <w:r>
         <w:rPr>
           <w:b/>
         </w:rPr>
-        <w:t>Programme / semester:</w:t>
-      </w:r>
-      <w:r>
-        <w:t xml:space="preserve"> [Programme and semester]</w:t>
+        <w:t>Programme</w:t>
+      </w:r>
+      <w:proofErr w:type="spellEnd"/>
+      <w:r>
+        <w:rPr>
+          <w:b/>
+        </w:rPr>
+        <w:t>:</w:t>
+      </w:r>
+      <w:r>
+        <w:t xml:space="preserve"> </w:t>
+      </w:r>
+      <w:r>
+        <w:t>B. Tech CSE (Data Science)</w:t>
       </w:r>
     </w:p>
     <w:p>
@@ -74,7 +91,18 @@
         <w:t>Submitted by:</w:t>
       </w:r>
       <w:r>
-        <w:t xml:space="preserve"> [Student names and USNs]</w:t>
+        <w:t xml:space="preserve"> </w:t>
+      </w:r>
+      <w:r>
+        <w:t xml:space="preserve">Sinchana B Kurkuri (24BDS0352), Prachi Pandurang </w:t>
+      </w:r>
+      <w:proofErr w:type="spellStart"/>
+      <w:r>
+        <w:t>Raddi</w:t>
+      </w:r>
+      <w:proofErr w:type="spellEnd"/>
+      <w:r>
+        <w:t xml:space="preserve"> (24BDS0389)</w:t>
       </w:r>
     </w:p>
     <w:p>
@@ -88,7 +116,10 @@
         <w:t>Project guide:</w:t>
       </w:r>
       <w:r>
-        <w:t xml:space="preserve"> [Guide name and designation]</w:t>
+        <w:t xml:space="preserve"> </w:t>
+      </w:r>
+      <w:r>
+        <w:t>Dr. Nithya N S</w:t>
       </w:r>
     </w:p>
     <w:p>
@@ -102,7 +133,10 @@
         <w:t>Academic year:</w:t>
       </w:r>
       <w:r>
-        <w:t xml:space="preserve"> [Academic year]</w:t>
+        <w:t xml:space="preserve"> </w:t>
+      </w:r>
+      <w:r>
+        <w:t>2026-27</w:t>
       </w:r>
     </w:p>
     <w:p>
@@ -131,48 +165,6 @@
       </w:r>
       <w:r>
         <w:t xml:space="preserve"> Bank-Transaction-System-ACID-Compliance-Fraud-Detection-Performance-Tuning</w:t>
-      </w:r>
-    </w:p>
-    <w:p>
-      <w:pPr>
-        <w:jc w:val="center"/>
-      </w:pPr>
-      <w:r>
-        <w:rPr>
-          <w:b/>
-        </w:rPr>
-        <w:t>Verification base:</w:t>
-      </w:r>
-      <w:r>
-        <w:t xml:space="preserve"> branch </w:t>
-      </w:r>
-      <w:r>
-        <w:rPr>
-          <w:rFonts w:ascii="Consolas" w:eastAsia="Consolas" w:hAnsi="Consolas" w:cs="Consolas"/>
-          <w:sz w:val="20"/>
-        </w:rPr>
-        <w:t>feature/final-demo</w:t>
-      </w:r>
-      <w:r>
-        <w:t xml:space="preserve">, HEAD </w:t>
-      </w:r>
-      <w:r>
-        <w:rPr>
-          <w:rFonts w:ascii="Consolas" w:eastAsia="Consolas" w:hAnsi="Consolas" w:cs="Consolas"/>
-          <w:sz w:val="20"/>
-        </w:rPr>
-        <w:t>8298f855f2020f01a518eaa53425fa66af629962</w:t>
-      </w:r>
-      <w:r>
-        <w:t>, plus uncommitted CLI/dashboard delivery additions.</w:t>
-      </w:r>
-    </w:p>
-    <w:p>
-      <w:pPr>
-        <w:jc w:val="center"/>
-      </w:pPr>
-      <w:r>
-        <w:t>Personal and institutional fields intentionally remain placeholders for the authors. All banking identities and identifiers used in demonstrations are synthetic.</w:t>
       </w:r>
     </w:p>
     <w:p>
@@ -2730,7 +2722,15 @@
     </w:p>
     <w:p>
       <w:r>
-        <w:t>This project implements a MySQL8.4 banking transaction laboratory that connects financial operations with consistency checks, detective fraud evaluation and an auditable event history. Customers, accounts, deposits, withdrawals, transfers, loans and approval requests are represented by related InnoDB tables and public stored procedures. Ordered row locks and explicit transaction handlers protect multi-account transfers. Completed ledger entries are immutable, while audit and fraud triggers participate in the same transaction as the banking operation.</w:t>
+        <w:t xml:space="preserve">This project implements a MySQL8.4 banking transaction laboratory that connects financial operations with consistency checks, detective fraud evaluation and an auditable event history. Customers, accounts, deposits, withdrawals, transfers, loans and approval requests are represented by related </w:t>
+      </w:r>
+      <w:proofErr w:type="spellStart"/>
+      <w:r>
+        <w:t>InnoDB</w:t>
+      </w:r>
+      <w:proofErr w:type="spellEnd"/>
+      <w:r>
+        <w:t xml:space="preserve"> tables and public stored procedures. Ordered row locks and explicit transaction handlers protect multi-account transfers. Completed ledger entries are immutable, while audit and fraud triggers participate in the same transaction as the banking operation.</w:t>
       </w:r>
     </w:p>
     <w:p>
@@ -3050,7 +3050,15 @@
               <w:jc w:val="left"/>
             </w:pPr>
             <w:r>
-              <w:t>MySQL8.4 with InnoDB, CHECK constraints, JSON, window functions and stored objects; measured8.4.11</w:t>
+              <w:t xml:space="preserve">MySQL8.4 with </w:t>
+            </w:r>
+            <w:proofErr w:type="spellStart"/>
+            <w:r>
+              <w:t>InnoDB</w:t>
+            </w:r>
+            <w:proofErr w:type="spellEnd"/>
+            <w:r>
+              <w:t>, CHECK constraints, JSON, window functions and stored objects; measured8.4.11</w:t>
             </w:r>
           </w:p>
         </w:tc>
@@ -3150,7 +3158,15 @@
               <w:jc w:val="left"/>
             </w:pPr>
             <w:r>
-              <w:t>Native mysql executable; external private client option file</w:t>
+              <w:t xml:space="preserve">Native </w:t>
+            </w:r>
+            <w:proofErr w:type="spellStart"/>
+            <w:r>
+              <w:t>mysql</w:t>
+            </w:r>
+            <w:proofErr w:type="spellEnd"/>
+            <w:r>
+              <w:t xml:space="preserve"> executable; external private client option file</w:t>
             </w:r>
           </w:p>
         </w:tc>
@@ -3406,7 +3422,15 @@
     </w:tbl>
     <w:p>
       <w:r>
-        <w:t>Flask was absent from the available runtime. The permitted standard-library HTTP-server fallback was used instead of introducing an installation dependency. This choice is appropriate only for the bounded local evaluation: Python's http.server documentation cautions against production use [R5].</w:t>
+        <w:t xml:space="preserve">Flask was absent from the available runtime. The permitted standard-library HTTP-server fallback was used instead of introducing an installation dependency. This choice is appropriate only for the bounded local evaluation: Python's </w:t>
+      </w:r>
+      <w:proofErr w:type="spellStart"/>
+      <w:r>
+        <w:t>http.server</w:t>
+      </w:r>
+      <w:proofErr w:type="spellEnd"/>
+      <w:r>
+        <w:t xml:space="preserve"> documentation cautions against production use [R5].</w:t>
       </w:r>
     </w:p>
     <w:p>
@@ -3495,7 +3519,15 @@
     </w:p>
     <w:p>
       <w:r>
-        <w:t>The native client receives UTF-8 SQL through stdin with no shell interpolation. All financial mutations use public routines. Read-only metadata is obtained from information_schema. A request lock prevents overlapping dashboard actions and snapshots from confusing an instructional before/after comparison; genuine concurrency is established separately by the existing native-session experiments.</w:t>
+        <w:t xml:space="preserve">The native client receives UTF-8 SQL through stdin with no shell interpolation. All financial mutations use public routines. Read-only metadata is obtained from </w:t>
+      </w:r>
+      <w:proofErr w:type="spellStart"/>
+      <w:r>
+        <w:t>information_schema</w:t>
+      </w:r>
+      <w:proofErr w:type="spellEnd"/>
+      <w:r>
+        <w:t>. A request lock prevents overlapping dashboard actions and snapshots from confusing an instructional before/after comparison; genuine concurrency is established separately by the existing native-session experiments.</w:t>
       </w:r>
     </w:p>
     <w:p>
@@ -3535,13 +3567,12 @@
       <w:r>
         <w:rPr>
           <w:noProof/>
-          <w:sz w:val="2"/>
         </w:rPr>
         <w:drawing>
-          <wp:inline distT="0" distB="0" distL="0" distR="0" wp14:anchorId="083A4368" wp14:editId="3E389E9C">
-            <wp:extent cx="6861634" cy="4315968"/>
-            <wp:effectExtent l="0" t="0" r="0" b="0"/>
-            <wp:docPr id="2" name="Picture 2" descr="Entity Relationship Model"/>
+          <wp:inline distT="0" distB="0" distL="0" distR="0" wp14:anchorId="2715E81B" wp14:editId="7E0203A2">
+            <wp:extent cx="6792686" cy="4503914"/>
+            <wp:effectExtent l="0" t="0" r="8255" b="0"/>
+            <wp:docPr id="79" name="ER_Diagram_Bank_Transaction_System.png" descr="ER_Diagram_Bank_Transaction_System.png"/>
             <wp:cNvGraphicFramePr>
               <a:graphicFrameLocks xmlns:a="http://schemas.openxmlformats.org/drawingml/2006/main" noChangeAspect="1"/>
             </wp:cNvGraphicFramePr>
@@ -3549,8 +3580,10 @@
               <a:graphicData uri="http://schemas.openxmlformats.org/drawingml/2006/picture">
                 <pic:pic xmlns:pic="http://schemas.openxmlformats.org/drawingml/2006/picture">
                   <pic:nvPicPr>
-                    <pic:cNvPr id="0" name="er-doc.png"/>
-                    <pic:cNvPicPr/>
+                    <pic:cNvPr id="79" name="ER_Diagram_Bank_Transaction_System.png" descr="ER_Diagram_Bank_Transaction_System.png"/>
+                    <pic:cNvPicPr>
+                      <a:picLocks noChangeAspect="1"/>
+                    </pic:cNvPicPr>
                   </pic:nvPicPr>
                   <pic:blipFill>
                     <a:blip r:embed="rId10"/>
@@ -3561,11 +3594,14 @@
                   <pic:spPr>
                     <a:xfrm>
                       <a:off x="0" y="0"/>
-                      <a:ext cx="6861634" cy="4315968"/>
+                      <a:ext cx="6805315" cy="4512288"/>
                     </a:xfrm>
                     <a:prstGeom prst="rect">
                       <a:avLst/>
                     </a:prstGeom>
+                    <a:ln w="12700">
+                      <a:miter lim="400000"/>
+                    </a:ln>
                   </pic:spPr>
                 </pic:pic>
               </a:graphicData>
@@ -3746,8 +3782,13 @@
               <w:spacing w:before="40" w:after="40" w:line="259" w:lineRule="auto"/>
               <w:jc w:val="left"/>
             </w:pPr>
+            <w:proofErr w:type="spellStart"/>
             <w:r>
-              <w:t>branch_id PK; unique synthetic IFSC code</w:t>
+              <w:t>branch_id</w:t>
+            </w:r>
+            <w:proofErr w:type="spellEnd"/>
+            <w:r>
+              <w:t xml:space="preserve"> PK; unique synthetic IFSC code</w:t>
             </w:r>
           </w:p>
         </w:tc>
@@ -3796,8 +3837,13 @@
               <w:spacing w:before="40" w:after="40" w:line="259" w:lineRule="auto"/>
               <w:jc w:val="left"/>
             </w:pPr>
+            <w:proofErr w:type="spellStart"/>
             <w:r>
-              <w:t>employee_id PK; branch FK; unique email; Teller/Manager/DBA</w:t>
+              <w:t>employee_id</w:t>
+            </w:r>
+            <w:proofErr w:type="spellEnd"/>
+            <w:r>
+              <w:t xml:space="preserve"> PK; branch FK; unique email; Teller/Manager/DBA</w:t>
             </w:r>
           </w:p>
         </w:tc>
@@ -3846,8 +3892,13 @@
               <w:spacing w:before="40" w:after="40" w:line="259" w:lineRule="auto"/>
               <w:jc w:val="left"/>
             </w:pPr>
+            <w:proofErr w:type="spellStart"/>
             <w:r>
-              <w:t>customer_id PK; unique email, phone and proof; active/KYC attributes</w:t>
+              <w:t>customer_id</w:t>
+            </w:r>
+            <w:proofErr w:type="spellEnd"/>
+            <w:r>
+              <w:t xml:space="preserve"> PK; unique email, phone and proof; active/KYC attributes</w:t>
             </w:r>
           </w:p>
         </w:tc>
@@ -3874,9 +3925,11 @@
               <w:spacing w:before="40" w:after="40" w:line="259" w:lineRule="auto"/>
               <w:jc w:val="left"/>
             </w:pPr>
+            <w:proofErr w:type="spellStart"/>
             <w:r>
               <w:t>Account_Types</w:t>
             </w:r>
+            <w:proofErr w:type="spellEnd"/>
           </w:p>
         </w:tc>
         <w:tc>
@@ -3896,8 +3949,13 @@
               <w:spacing w:before="40" w:after="40" w:line="259" w:lineRule="auto"/>
               <w:jc w:val="left"/>
             </w:pPr>
+            <w:proofErr w:type="spellStart"/>
             <w:r>
-              <w:t>account_type_id PK; unique name; rate and minimum balance</w:t>
+              <w:t>account_type_id</w:t>
+            </w:r>
+            <w:proofErr w:type="spellEnd"/>
+            <w:r>
+              <w:t xml:space="preserve"> PK; unique name; rate and minimum balance</w:t>
             </w:r>
           </w:p>
         </w:tc>
@@ -3946,8 +4004,13 @@
               <w:spacing w:before="40" w:after="40" w:line="259" w:lineRule="auto"/>
               <w:jc w:val="left"/>
             </w:pPr>
+            <w:proofErr w:type="spellStart"/>
             <w:r>
-              <w:t>account_id PK; customer/branch/type FKs; unique number; balance/status</w:t>
+              <w:t>account_id</w:t>
+            </w:r>
+            <w:proofErr w:type="spellEnd"/>
+            <w:r>
+              <w:t xml:space="preserve"> PK; customer/branch/type FKs; unique number; balance/status</w:t>
             </w:r>
           </w:p>
         </w:tc>
@@ -3997,7 +4060,15 @@
               <w:jc w:val="left"/>
             </w:pPr>
             <w:r>
-              <w:t>BIGINT transaction_id PK; account/counterparty/employee/device/location references; transfer group; amount/status/reference</w:t>
+              <w:t xml:space="preserve">BIGINT </w:t>
+            </w:r>
+            <w:proofErr w:type="spellStart"/>
+            <w:r>
+              <w:t>transaction_id</w:t>
+            </w:r>
+            <w:proofErr w:type="spellEnd"/>
+            <w:r>
+              <w:t xml:space="preserve"> PK; account/counterparty/employee/device/location references; transfer group; amount/status/reference</w:t>
             </w:r>
           </w:p>
         </w:tc>
@@ -4046,8 +4117,13 @@
               <w:spacing w:before="40" w:after="40" w:line="259" w:lineRule="auto"/>
               <w:jc w:val="left"/>
             </w:pPr>
+            <w:proofErr w:type="spellStart"/>
             <w:r>
-              <w:t>loan_id PK; customer FK; optional disbursement account FK</w:t>
+              <w:t>loan_id</w:t>
+            </w:r>
+            <w:proofErr w:type="spellEnd"/>
+            <w:r>
+              <w:t xml:space="preserve"> PK; customer FK; optional disbursement account FK</w:t>
             </w:r>
           </w:p>
         </w:tc>
@@ -4074,9 +4150,11 @@
               <w:spacing w:before="40" w:after="40" w:line="259" w:lineRule="auto"/>
               <w:jc w:val="left"/>
             </w:pPr>
+            <w:proofErr w:type="spellStart"/>
             <w:r>
               <w:t>Fraud_Flags</w:t>
             </w:r>
+            <w:proofErr w:type="spellEnd"/>
           </w:p>
         </w:tc>
         <w:tc>
@@ -4096,8 +4174,13 @@
               <w:spacing w:before="40" w:after="40" w:line="259" w:lineRule="auto"/>
               <w:jc w:val="left"/>
             </w:pPr>
+            <w:proofErr w:type="spellStart"/>
             <w:r>
-              <w:t>flag_id PK; transaction/rule references; score, JSON evidence, review status</w:t>
+              <w:t>flag_id</w:t>
+            </w:r>
+            <w:proofErr w:type="spellEnd"/>
+            <w:r>
+              <w:t xml:space="preserve"> PK; transaction/rule references; score, JSON evidence, review status</w:t>
             </w:r>
           </w:p>
         </w:tc>
@@ -4124,9 +4207,11 @@
               <w:spacing w:before="40" w:after="40" w:line="259" w:lineRule="auto"/>
               <w:jc w:val="left"/>
             </w:pPr>
+            <w:proofErr w:type="spellStart"/>
             <w:r>
               <w:t>Audit_Log</w:t>
             </w:r>
+            <w:proofErr w:type="spellEnd"/>
           </w:p>
         </w:tc>
         <w:tc>
@@ -4147,7 +4232,15 @@
               <w:jc w:val="left"/>
             </w:pPr>
             <w:r>
-              <w:t>BIGINT audit_id PK; JSON old/new values; session and optional actor FKs</w:t>
+              <w:t xml:space="preserve">BIGINT </w:t>
+            </w:r>
+            <w:proofErr w:type="spellStart"/>
+            <w:r>
+              <w:t>audit_id</w:t>
+            </w:r>
+            <w:proofErr w:type="spellEnd"/>
+            <w:r>
+              <w:t xml:space="preserve"> PK; JSON old/new values; session and optional actor FKs</w:t>
             </w:r>
           </w:p>
         </w:tc>
@@ -4196,8 +4289,13 @@
               <w:spacing w:before="40" w:after="40" w:line="259" w:lineRule="auto"/>
               <w:jc w:val="left"/>
             </w:pPr>
+            <w:proofErr w:type="spellStart"/>
             <w:r>
-              <w:t>device_id PK; customer FK; unique fingerprint; trust flag</w:t>
+              <w:t>device_id</w:t>
+            </w:r>
+            <w:proofErr w:type="spellEnd"/>
+            <w:r>
+              <w:t xml:space="preserve"> PK; customer FK; unique fingerprint; trust flag</w:t>
             </w:r>
           </w:p>
         </w:tc>
@@ -4246,8 +4344,13 @@
               <w:spacing w:before="40" w:after="40" w:line="259" w:lineRule="auto"/>
               <w:jc w:val="left"/>
             </w:pPr>
+            <w:proofErr w:type="spellStart"/>
             <w:r>
-              <w:t>location_id PK; geographical descriptive/coordinate columns</w:t>
+              <w:t>location_id</w:t>
+            </w:r>
+            <w:proofErr w:type="spellEnd"/>
+            <w:r>
+              <w:t xml:space="preserve"> PK; geographical descriptive/coordinate columns</w:t>
             </w:r>
           </w:p>
         </w:tc>
@@ -4274,9 +4377,11 @@
               <w:spacing w:before="40" w:after="40" w:line="259" w:lineRule="auto"/>
               <w:jc w:val="left"/>
             </w:pPr>
+            <w:proofErr w:type="spellStart"/>
             <w:r>
               <w:t>Fraud_Rules</w:t>
             </w:r>
+            <w:proofErr w:type="spellEnd"/>
           </w:p>
         </w:tc>
         <w:tc>
@@ -4296,8 +4401,13 @@
               <w:spacing w:before="40" w:after="40" w:line="259" w:lineRule="auto"/>
               <w:jc w:val="left"/>
             </w:pPr>
+            <w:proofErr w:type="spellStart"/>
             <w:r>
-              <w:t>rule_id PK; unique code; weight, parameters and active flag</w:t>
+              <w:t>rule_id</w:t>
+            </w:r>
+            <w:proofErr w:type="spellEnd"/>
+            <w:r>
+              <w:t xml:space="preserve"> PK; unique code; weight, parameters and active flag</w:t>
             </w:r>
           </w:p>
         </w:tc>
@@ -4324,9 +4434,11 @@
               <w:spacing w:before="40" w:after="40" w:line="259" w:lineRule="auto"/>
               <w:jc w:val="left"/>
             </w:pPr>
+            <w:proofErr w:type="spellStart"/>
             <w:r>
               <w:t>Account_Risk_Profile</w:t>
             </w:r>
+            <w:proofErr w:type="spellEnd"/>
           </w:p>
         </w:tc>
         <w:tc>
@@ -4346,8 +4458,13 @@
               <w:spacing w:before="40" w:after="40" w:line="259" w:lineRule="auto"/>
               <w:jc w:val="left"/>
             </w:pPr>
+            <w:proofErr w:type="spellStart"/>
             <w:r>
-              <w:t>account_id PK/FK; score, level and evaluation/update times</w:t>
+              <w:t>account_id</w:t>
+            </w:r>
+            <w:proofErr w:type="spellEnd"/>
+            <w:r>
+              <w:t xml:space="preserve"> PK/FK; score, level and evaluation/update times</w:t>
             </w:r>
           </w:p>
         </w:tc>
@@ -4374,9 +4491,11 @@
               <w:spacing w:before="40" w:after="40" w:line="259" w:lineRule="auto"/>
               <w:jc w:val="left"/>
             </w:pPr>
+            <w:proofErr w:type="spellStart"/>
             <w:r>
               <w:t>DB_User_Map</w:t>
             </w:r>
+            <w:proofErr w:type="spellEnd"/>
           </w:p>
         </w:tc>
         <w:tc>
@@ -4396,9 +4515,19 @@
               <w:spacing w:before="40" w:after="40" w:line="259" w:lineRule="auto"/>
               <w:jc w:val="left"/>
             </w:pPr>
+            <w:proofErr w:type="spellStart"/>
             <w:r>
-              <w:t>db_login PK; exactly one Customer or Employee FK according to actor_type</w:t>
+              <w:t>db_login</w:t>
             </w:r>
+            <w:proofErr w:type="spellEnd"/>
+            <w:r>
+              <w:t xml:space="preserve"> PK; exactly one Customer or Employee FK according to </w:t>
+            </w:r>
+            <w:proofErr w:type="spellStart"/>
+            <w:r>
+              <w:t>actor_type</w:t>
+            </w:r>
+            <w:proofErr w:type="spellEnd"/>
           </w:p>
         </w:tc>
       </w:tr>
@@ -4424,9 +4553,11 @@
               <w:spacing w:before="40" w:after="40" w:line="259" w:lineRule="auto"/>
               <w:jc w:val="left"/>
             </w:pPr>
+            <w:proofErr w:type="spellStart"/>
             <w:r>
               <w:t>Transaction_Approvals</w:t>
             </w:r>
+            <w:proofErr w:type="spellEnd"/>
           </w:p>
         </w:tc>
         <w:tc>
@@ -4446,8 +4577,13 @@
               <w:spacing w:before="40" w:after="40" w:line="259" w:lineRule="auto"/>
               <w:jc w:val="left"/>
             </w:pPr>
+            <w:proofErr w:type="spellStart"/>
             <w:r>
-              <w:t>approval_id PK; source/destination account FKs; requester/decision/group linkage</w:t>
+              <w:t>approval_id</w:t>
+            </w:r>
+            <w:proofErr w:type="spellEnd"/>
+            <w:r>
+              <w:t xml:space="preserve"> PK; source/destination account FKs; requester/decision/group linkage</w:t>
             </w:r>
           </w:p>
         </w:tc>
@@ -4473,9 +4609,11 @@
               <w:spacing w:before="40" w:after="40" w:line="259" w:lineRule="auto"/>
               <w:jc w:val="left"/>
             </w:pPr>
+            <w:proofErr w:type="spellStart"/>
             <w:r>
               <w:t>Fraud_Ground_Truth</w:t>
             </w:r>
+            <w:proofErr w:type="spellEnd"/>
           </w:p>
         </w:tc>
         <w:tc>
@@ -4494,16 +4632,42 @@
               <w:spacing w:before="40" w:after="40" w:line="259" w:lineRule="auto"/>
               <w:jc w:val="left"/>
             </w:pPr>
+            <w:proofErr w:type="spellStart"/>
             <w:r>
-              <w:t>transaction_id PK/FK; synthetic label for evaluation datasets</w:t>
+              <w:t>transaction_id</w:t>
+            </w:r>
+            <w:proofErr w:type="spellEnd"/>
+            <w:r>
+              <w:t xml:space="preserve"> PK/FK; synthetic label for evaluation datasets</w:t>
             </w:r>
           </w:p>
         </w:tc>
       </w:tr>
     </w:tbl>
     <w:p>
-      <w:r>
-        <w:t xml:space="preserve">Transactions.related_account_id is an optional second Accounts reference. Approvals have two distinct Accounts references, not a single composite account. Additional employee references identify transaction staff, reviewers and decision makers. Audit_Log.table_name/record_pk is a polymorphic audit label, deliberately not a generic FK. </w:t>
+      <w:proofErr w:type="spellStart"/>
+      <w:r>
+        <w:t>Transactions.related_account_id</w:t>
+      </w:r>
+      <w:proofErr w:type="spellEnd"/>
+      <w:r>
+        <w:t xml:space="preserve"> is an optional second Accounts reference. Approvals have two distinct Accounts references, not a single composite account. Additional employee references identify transaction staff, reviewers and decision makers. </w:t>
+      </w:r>
+      <w:proofErr w:type="spellStart"/>
+      <w:r>
+        <w:t>Audit_Log.table_name</w:t>
+      </w:r>
+      <w:proofErr w:type="spellEnd"/>
+      <w:r>
+        <w:t>/</w:t>
+      </w:r>
+      <w:proofErr w:type="spellStart"/>
+      <w:r>
+        <w:t>record_pk</w:t>
+      </w:r>
+      <w:proofErr w:type="spellEnd"/>
+      <w:r>
+        <w:t xml:space="preserve"> is a polymorphic audit label, deliberately not a generic FK. </w:t>
       </w:r>
       <w:r>
         <w:lastRenderedPageBreak/>
@@ -4522,12 +4686,52 @@
     </w:p>
     <w:p>
       <w:r>
-        <w:t>Separate Branches, Employees, Customers and Account_Types relations avoid repeating descriptive data in every transaction. A transaction references an account instead of duplicating its owner's complete identity. Fraud rule catalog and flag instances separate policy configuration from observations. Unique candidate keys prevent duplicate natural identifiers, and FKs maintain referenced entity existence using RESTRICT actions.</w:t>
-      </w:r>
-    </w:p>
-    <w:p>
-      <w:r>
-        <w:t>The design is substantially normalized, but intentionally stores derived state: Accounts.balance supports efficient locked updates, Account_Risk_Profile stores summary risk and Audit_Log/Fraud_Flags contain historical JSON evidence. Such choices require reconciliation and clear lifecycle rules rather than an unsupported claim that every stored attribute is an independent third-normal-form fact.</w:t>
+        <w:t xml:space="preserve">Separate Branches, Employees, Customers and </w:t>
+      </w:r>
+      <w:proofErr w:type="spellStart"/>
+      <w:r>
+        <w:t>Account_Types</w:t>
+      </w:r>
+      <w:proofErr w:type="spellEnd"/>
+      <w:r>
+        <w:t xml:space="preserve"> relations avoid repeating descriptive data in every transaction. A transaction references an account instead of duplicating its owner's complete identity. Fraud rule catalog and flag instances separate policy configuration from observations. Unique candidate keys prevent duplicate natural identifiers, and FKs maintain referenced entity existence using RESTRICT actions.</w:t>
+      </w:r>
+    </w:p>
+    <w:p>
+      <w:r>
+        <w:t xml:space="preserve">The design is substantially normalized, but intentionally stores derived state: </w:t>
+      </w:r>
+      <w:proofErr w:type="spellStart"/>
+      <w:r>
+        <w:t>Accounts.balance</w:t>
+      </w:r>
+      <w:proofErr w:type="spellEnd"/>
+      <w:r>
+        <w:t xml:space="preserve"> supports efficient locked updates, </w:t>
+      </w:r>
+      <w:proofErr w:type="spellStart"/>
+      <w:r>
+        <w:t>Account_Risk_Profile</w:t>
+      </w:r>
+      <w:proofErr w:type="spellEnd"/>
+      <w:r>
+        <w:t xml:space="preserve"> stores summary risk and </w:t>
+      </w:r>
+      <w:proofErr w:type="spellStart"/>
+      <w:r>
+        <w:t>Audit_Log</w:t>
+      </w:r>
+      <w:proofErr w:type="spellEnd"/>
+      <w:r>
+        <w:t>/</w:t>
+      </w:r>
+      <w:proofErr w:type="spellStart"/>
+      <w:r>
+        <w:t>Fraud_Flags</w:t>
+      </w:r>
+      <w:proofErr w:type="spellEnd"/>
+      <w:r>
+        <w:t xml:space="preserve"> contain historical JSON evidence. Such choices require reconciliation and clear lifecycle rules rather than an unsupported claim that every stored attribute is an independent third-normal-form fact.</w:t>
       </w:r>
     </w:p>
     <w:p>
@@ -4552,7 +4756,23 @@
     </w:p>
     <w:p>
       <w:r>
-        <w:t>Deposit/withdraw routines validate amount/channel/staff and lock the account. Withdrawal preserves the type's minimum balance. Transfers lock two Accounts rows in canonical account-ID order, compute balances under those locks and use relative updates. They write one TransferOut and one TransferIn with the same UUID, equal amounts and mirrored account/counterparty fields. Device/location metadata is stored only on the debit transfer leg. Public signatures are unchanged.</w:t>
+        <w:t xml:space="preserve">Deposit/withdraw routines validate amount/channel/staff and lock the account. Withdrawal preserves the type's minimum balance. Transfers lock two Accounts rows in canonical account-ID order, compute balances under those locks and use relative updates. They write one </w:t>
+      </w:r>
+      <w:proofErr w:type="spellStart"/>
+      <w:r>
+        <w:t>TransferOut</w:t>
+      </w:r>
+      <w:proofErr w:type="spellEnd"/>
+      <w:r>
+        <w:t xml:space="preserve"> and one </w:t>
+      </w:r>
+      <w:proofErr w:type="spellStart"/>
+      <w:r>
+        <w:t>TransferIn</w:t>
+      </w:r>
+      <w:proofErr w:type="spellEnd"/>
+      <w:r>
+        <w:t xml:space="preserve"> with the same UUID, equal amounts and mirrored account/counterparty fields. Device/location metadata is stored only on the debit transfer leg. Public signatures are unchanged.</w:t>
       </w:r>
     </w:p>
     <w:p>
@@ -4595,7 +4815,23 @@
         <w:t>Consistency.</w:t>
       </w:r>
       <w:r>
-        <w:t xml:space="preserve"> Six executable invariants inspect derived state rather than assuming that successful SQL means a valid system. They cover balance/ledger equality, per-account balance_after chains, paired transfers, minimum-balance rules, audit watermark coverage and the newest Completed balance_after.</w:t>
+        <w:t xml:space="preserve"> Six executable invariants inspect derived state rather than assuming that successful SQL means a valid system. They cover balance/ledger equality, per-account </w:t>
+      </w:r>
+      <w:proofErr w:type="spellStart"/>
+      <w:r>
+        <w:t>balance_after</w:t>
+      </w:r>
+      <w:proofErr w:type="spellEnd"/>
+      <w:r>
+        <w:t xml:space="preserve"> chains, paired transfers, minimum-balance rules, audit watermark coverage and the newest Completed </w:t>
+      </w:r>
+      <w:proofErr w:type="spellStart"/>
+      <w:r>
+        <w:t>balance_after</w:t>
+      </w:r>
+      <w:proofErr w:type="spellEnd"/>
+      <w:r>
+        <w:t>.</w:t>
       </w:r>
     </w:p>
     <w:p>
@@ -4656,12 +4892,28 @@
     </w:p>
     <w:p>
       <w:r>
-        <w:t>The real comparison created a cycle using EXP10's temporary database-only mode3 first-lock scheduling pause. One native session received1213 and one completed. The original routine was restored afterward; ordered mode and shipping source were unchanged. An earlier uninstrumented run did not deadlock and was retained as a failed expectation rather than relabeled as success.</w:t>
-      </w:r>
-    </w:p>
-    <w:p>
-      <w:r>
-        <w:t>The public retry wrapper retried whole transactions after actual1213/1205, recorded its retry after rollback and used bounded randomized backoff. The verified pair of retry calls completed and produced a committed DEADLOCK_RETRY row. Error1205 is a wait-timeout observation, not proof of a cycle; the project's procedure handler explicitly rolls back its transaction. InnoDB deadlock handling and application retry should be considered together [R2].</w:t>
+        <w:t xml:space="preserve">The real comparison created a cycle using EXP10's temporary database-only mode3 first-lock scheduling pause. One native session received1213 and one completed. The original routine was restored afterward; ordered mode and shipping source were unchanged. An earlier </w:t>
+      </w:r>
+      <w:proofErr w:type="spellStart"/>
+      <w:r>
+        <w:t>uninstrumented</w:t>
+      </w:r>
+      <w:proofErr w:type="spellEnd"/>
+      <w:r>
+        <w:t xml:space="preserve"> run did not deadlock and was retained as a failed expectation rather than relabeled as success.</w:t>
+      </w:r>
+    </w:p>
+    <w:p>
+      <w:r>
+        <w:t xml:space="preserve">The public retry wrapper retried whole transactions after actual1213/1205, recorded its retry after rollback and used bounded randomized backoff. The verified pair of retry calls completed and produced a committed DEADLOCK_RETRY row. Error1205 is a wait-timeout observation, not proof of a cycle; the project's procedure handler explicitly rolls back its transaction. </w:t>
+      </w:r>
+      <w:proofErr w:type="spellStart"/>
+      <w:r>
+        <w:t>InnoDB</w:t>
+      </w:r>
+      <w:proofErr w:type="spellEnd"/>
+      <w:r>
+        <w:t xml:space="preserve"> deadlock handling and application retry should be considered together [R2].</w:t>
       </w:r>
     </w:p>
     <w:p>
@@ -5195,7 +5447,15 @@
     </w:p>
     <w:p>
       <w:r>
-        <w:t>Public banking routines provide validated operations; private sp_internal_* helpers avoid transaction control so the caller owns atomicity. Functions include balance/available-balance/interest/reference/masking/approval helpers and the seven specified fraud functions: distance, z-score, count window, odd hour, account age, transaction risk score and risk level. Their signatures are checked by existing regressions.</w:t>
+        <w:t xml:space="preserve">Public banking routines provide validated operations; private </w:t>
+      </w:r>
+      <w:proofErr w:type="spellStart"/>
+      <w:r>
+        <w:t>sp_internal</w:t>
+      </w:r>
+      <w:proofErr w:type="spellEnd"/>
+      <w:r>
+        <w:t>_* helpers avoid transaction control so the caller owns atomicity. Functions include balance/available-balance/interest/reference/masking/approval helpers and the seven specified fraud functions: distance, z-score, count window, odd hour, account age, transaction risk score and risk level. Their signatures are checked by existing regressions.</w:t>
       </w:r>
     </w:p>
     <w:p>
@@ -5209,7 +5469,31 @@
     </w:p>
     <w:p>
       <w:r>
-        <w:t>The views are v_customer_account_summary, v_transaction_activity and v_fraud_case_queue. The dashboard shows their installed DEFINER metadata. Source files and build/file_order.txt preserve A/B dependency order: tables, FKs, functions, procedures, guards/audit/watermark, rules/fraud trigger, seed and views. RBAC deployment and optional indexes are separate explicit operations.</w:t>
+        <w:t xml:space="preserve">The views are </w:t>
+      </w:r>
+      <w:proofErr w:type="spellStart"/>
+      <w:r>
+        <w:t>v_customer_account_summary</w:t>
+      </w:r>
+      <w:proofErr w:type="spellEnd"/>
+      <w:r>
+        <w:t xml:space="preserve">, </w:t>
+      </w:r>
+      <w:proofErr w:type="spellStart"/>
+      <w:r>
+        <w:t>v_transaction_activity</w:t>
+      </w:r>
+      <w:proofErr w:type="spellEnd"/>
+      <w:r>
+        <w:t xml:space="preserve"> and </w:t>
+      </w:r>
+      <w:proofErr w:type="spellStart"/>
+      <w:r>
+        <w:t>v_fraud_case_queue</w:t>
+      </w:r>
+      <w:proofErr w:type="spellEnd"/>
+      <w:r>
+        <w:t>. The dashboard shows their installed DEFINER metadata. Source files and build/file_order.txt preserve A/B dependency order: tables, FKs, functions, procedures, guards/audit/watermark, rules/fraud trigger, seed and views. RBAC deployment and optional indexes are separate explicit operations.</w:t>
       </w:r>
     </w:p>
     <w:p>
@@ -5224,12 +5508,28 @@
     </w:p>
     <w:p>
       <w:r>
-        <w:t>The database role design covers Customer, Teller, Manager and Auditor. Public procedure EXECUTE grants are explicit; private helpers and wildcard EXECUTE are not application permissions. Identity resolution follows actual USER() through DB_User_Map, with documented fallback behavior. Application roles require a correct mapping; selecting a role label in a GUI would not authenticate anyone. MySQL roles represent collections of privileges and must actually be granted and activated for a restricted login [R4].</w:t>
-      </w:r>
-    </w:p>
-    <w:p>
-      <w:r>
-        <w:t>Customers receive own summary/activity and approved public financial/statement APIs. Staff activity is active and branch-filtered. Managers have the fraud queue and manager APIs but no Audit_Log SELECT grant; the customer-summary view does not become an all-account view merely because a Manager can SELECT it. Auditor receives read-only approved information, not statement/mutation EXECUTE. Unmapped auditor activity may be empty under the implemented identity filters.</w:t>
+        <w:t xml:space="preserve">The database role design covers Customer, Teller, Manager and Auditor. Public procedure EXECUTE grants are explicit; private helpers and wildcard EXECUTE are not application permissions. Identity resolution follows actual USER() through </w:t>
+      </w:r>
+      <w:proofErr w:type="spellStart"/>
+      <w:r>
+        <w:t>DB_User_Map</w:t>
+      </w:r>
+      <w:proofErr w:type="spellEnd"/>
+      <w:r>
+        <w:t>, with documented fallback behavior. Application roles require a correct mapping; selecting a role label in a GUI would not authenticate anyone. MySQL roles represent collections of privileges and must actually be granted and activated for a restricted login [R4].</w:t>
+      </w:r>
+    </w:p>
+    <w:p>
+      <w:r>
+        <w:t xml:space="preserve">Customers receive own summary/activity and approved public financial/statement APIs. Staff activity is active and branch-filtered. Managers have the fraud queue and manager APIs but no </w:t>
+      </w:r>
+      <w:proofErr w:type="spellStart"/>
+      <w:r>
+        <w:t>Audit_Log</w:t>
+      </w:r>
+      <w:proofErr w:type="spellEnd"/>
+      <w:r>
+        <w:t xml:space="preserve"> SELECT grant; the customer-summary view does not become an all-account view merely because a Manager can SELECT it. Auditor receives read-only approved information, not statement/mutation EXECUTE. Unmapped auditor activity may be empty under the implemented identity filters.</w:t>
       </w:r>
     </w:p>
     <w:p>
@@ -5239,7 +5539,15 @@
     </w:p>
     <w:p>
       <w:r>
-        <w:t>Audit rows include entity, action, old/new JSON, performed_at, session USER() and resolved actor. The watermark records when trigger coverage began. Earlier loaded rows are not falsely treated as missing new audit events. UPDATE/DELETE guards do not make the log safe from a privileged DBA who can drop triggers or truncate tables. The report does not describe it as tamper-proof.</w:t>
+        <w:t xml:space="preserve">Audit rows include entity, action, old/new JSON, </w:t>
+      </w:r>
+      <w:proofErr w:type="spellStart"/>
+      <w:r>
+        <w:t>performed_at</w:t>
+      </w:r>
+      <w:proofErr w:type="spellEnd"/>
+      <w:r>
+        <w:t>, session USER() and resolved actor. The watermark records when trigger coverage began. Earlier loaded rows are not falsely treated as missing new audit events. UPDATE/DELETE guards do not make the log safe from a privileged DBA who can drop triggers or truncate tables. The report does not describe it as tamper-proof.</w:t>
       </w:r>
     </w:p>
     <w:p>
@@ -5311,7 +5619,15 @@
     </w:p>
     <w:p>
       <w:r>
-        <w:t>ACID provides a bounded live5016 rollback probe and reconciliation. Concurrency and Performance show labeled captured output; Audit shows live old/new JSON. RBAC explains the actual source contract and pending authentication test. The Architecture section is populated from information_schema, and Verification separates historical regression populations from its live six-invariant button.</w:t>
+        <w:t xml:space="preserve">ACID provides a bounded live5016 rollback probe and reconciliation. Concurrency and Performance show labeled captured output; Audit shows live old/new JSON. RBAC explains the actual source contract and pending authentication test. The Architecture section is populated from </w:t>
+      </w:r>
+      <w:proofErr w:type="spellStart"/>
+      <w:r>
+        <w:t>information_schema</w:t>
+      </w:r>
+      <w:proofErr w:type="spellEnd"/>
+      <w:r>
+        <w:t>, and Verification separates historical regression populations from its live six-invariant button.</w:t>
       </w:r>
     </w:p>
     <w:p>
@@ -6164,7 +6480,15 @@
     </w:tbl>
     <w:p>
       <w:r>
-        <w:t>The HTTP workflow opened20000, deposited100, withdrew25 and transferred50, observing20025.00. A6000 suspicious deposit produced actual matched flags with maximum score100. Review advanced an actual flag through UnderReview to Confirmed. The5016 rollback snapshots were identical. All six reconciliation results were PASS with0 violations: I1, I1b, I2, I3, I4 and I5. The browser added another public deposit and subsequent consistency is checked before owned cleanup.</w:t>
+        <w:t xml:space="preserve">The HTTP workflow opened20000, deposited100, withdrew25 and transferred50, observing20025.00. A6000 suspicious deposit produced actual matched flags with maximum score100. Review advanced an actual flag through </w:t>
+      </w:r>
+      <w:proofErr w:type="spellStart"/>
+      <w:r>
+        <w:t>UnderReview</w:t>
+      </w:r>
+      <w:proofErr w:type="spellEnd"/>
+      <w:r>
+        <w:t xml:space="preserve"> to Confirmed. The5016 rollback snapshots were identical. All six reconciliation results were PASS with0 violations: I1, I1b, I2, I3, I4 and I5. The browser added another public deposit and subsequent consistency is checked before owned cleanup.</w:t>
       </w:r>
     </w:p>
     <w:p>
@@ -6184,7 +6508,15 @@
     </w:p>
     <w:p>
       <w:r>
-        <w:t>The retained final-demo fixture contained10 Accounts,39 Transactions,132 flags and1 approval. Each of three fixed SELECTs had2 warmups and20 measured samples under each profile, for120 measured observations. Native session NOW(6) brackets excluded process startup but included query/result production and interstatement client/protocol overhead; they are not isolated CPU timings.</w:t>
+        <w:t xml:space="preserve">The retained final-demo fixture contained10 Accounts,39 Transactions,132 flags and1 approval. Each of three fixed SELECTs had2 warmups and20 measured samples under each profile, for120 measured observations. Native session NOW(6) brackets excluded process startup but included query/result production and </w:t>
+      </w:r>
+      <w:proofErr w:type="spellStart"/>
+      <w:r>
+        <w:t>interstatement</w:t>
+      </w:r>
+      <w:proofErr w:type="spellEnd"/>
+      <w:r>
+        <w:t xml:space="preserve"> client/protocol overhead; they are not isolated CPU timings.</w:t>
       </w:r>
     </w:p>
     <w:p>
@@ -6429,7 +6761,15 @@
               <w:jc w:val="left"/>
             </w:pPr>
             <w:r>
-              <w:t>FK ref/filesort to account/time range/backward scan</w:t>
+              <w:t>FK ref/</w:t>
+            </w:r>
+            <w:proofErr w:type="spellStart"/>
+            <w:r>
+              <w:t>filesort</w:t>
+            </w:r>
+            <w:proofErr w:type="spellEnd"/>
+            <w:r>
+              <w:t xml:space="preserve"> to account/time range/backward scan</w:t>
             </w:r>
           </w:p>
         </w:tc>
@@ -6523,7 +6863,15 @@
               <w:jc w:val="left"/>
             </w:pPr>
             <w:r>
-              <w:t>Full scan/filesort retained</w:t>
+              <w:t>Full scan/</w:t>
+            </w:r>
+            <w:proofErr w:type="spellStart"/>
+            <w:r>
+              <w:t>filesort</w:t>
+            </w:r>
+            <w:proofErr w:type="spellEnd"/>
+            <w:r>
+              <w:t xml:space="preserve"> retained</w:t>
             </w:r>
           </w:p>
         </w:tc>
@@ -6613,7 +6961,15 @@
               <w:jc w:val="left"/>
             </w:pPr>
             <w:r>
-              <w:t>ALL/filesort to status/requested index access</w:t>
+              <w:t>ALL/</w:t>
+            </w:r>
+            <w:proofErr w:type="spellStart"/>
+            <w:r>
+              <w:t>filesort</w:t>
+            </w:r>
+            <w:proofErr w:type="spellEnd"/>
+            <w:r>
+              <w:t xml:space="preserve"> to status/requested index access</w:t>
             </w:r>
           </w:p>
         </w:tc>
@@ -7004,177 +7360,1044 @@
     <w:p>
       <w:pPr>
         <w:pStyle w:val="Heading1"/>
+        <w:rPr>
+          <w:color w:val="auto"/>
+          <w:sz w:val="36"/>
+          <w:szCs w:val="36"/>
+          <w:lang w:val="en-IN" w:eastAsia="en-IN"/>
+        </w:rPr>
       </w:pPr>
       <w:bookmarkStart w:id="28" w:name="_Toc243431152"/>
       <w:r>
         <w:t>29. References</w:t>
       </w:r>
+      <w:bookmarkStart w:id="29" w:name="_Toc243431153"/>
       <w:bookmarkEnd w:id="28"/>
     </w:p>
     <w:p>
-      <w:r>
-        <w:t>All external references below are primary documentation, accessed20 October2026. No invented papers or student details are included.</w:t>
-      </w:r>
-    </w:p>
-    <w:p>
-      <w:pPr>
-        <w:pStyle w:val="ListBullet"/>
-      </w:pPr>
-      <w:r>
+      <w:pPr>
+        <w:spacing w:before="100" w:beforeAutospacing="1" w:after="100" w:afterAutospacing="1" w:line="240" w:lineRule="auto"/>
+        <w:jc w:val="left"/>
+        <w:rPr>
+          <w:color w:val="auto"/>
+          <w:szCs w:val="24"/>
+          <w:lang w:val="en-IN" w:eastAsia="en-IN"/>
+        </w:rPr>
+      </w:pPr>
+      <w:r>
+        <w:rPr>
+          <w:color w:val="auto"/>
+          <w:szCs w:val="24"/>
+          <w:lang w:val="en-IN" w:eastAsia="en-IN"/>
+        </w:rPr>
+        <w:t xml:space="preserve">[1] A. Silberschatz, H. F. Korth, and S. Sudarshan, </w:t>
+      </w:r>
+      <w:r>
+        <w:rPr>
+          <w:i/>
+          <w:iCs/>
+          <w:color w:val="auto"/>
+          <w:szCs w:val="24"/>
+          <w:lang w:val="en-IN" w:eastAsia="en-IN"/>
+        </w:rPr>
+        <w:t>Database System Concepts</w:t>
+      </w:r>
+      <w:r>
+        <w:rPr>
+          <w:color w:val="auto"/>
+          <w:szCs w:val="24"/>
+          <w:lang w:val="en-IN" w:eastAsia="en-IN"/>
+        </w:rPr>
+        <w:t>, 7th ed. New York, NY, USA: McGraw-Hill, 2019.</w:t>
+      </w:r>
+    </w:p>
+    <w:p>
+      <w:pPr>
+        <w:spacing w:before="100" w:beforeAutospacing="1" w:after="100" w:afterAutospacing="1" w:line="240" w:lineRule="auto"/>
+        <w:jc w:val="left"/>
+        <w:rPr>
+          <w:color w:val="auto"/>
+          <w:szCs w:val="24"/>
+          <w:lang w:val="en-IN" w:eastAsia="en-IN"/>
+        </w:rPr>
+      </w:pPr>
+      <w:r>
+        <w:rPr>
+          <w:color w:val="auto"/>
+          <w:szCs w:val="24"/>
+          <w:lang w:val="en-IN" w:eastAsia="en-IN"/>
+        </w:rPr>
+        <w:t xml:space="preserve">[2] R. Elmasri and S. B. Navathe, </w:t>
+      </w:r>
+      <w:r>
+        <w:rPr>
+          <w:i/>
+          <w:iCs/>
+          <w:color w:val="auto"/>
+          <w:szCs w:val="24"/>
+          <w:lang w:val="en-IN" w:eastAsia="en-IN"/>
+        </w:rPr>
+        <w:t>Fundamentals of Database Systems</w:t>
+      </w:r>
+      <w:r>
+        <w:rPr>
+          <w:color w:val="auto"/>
+          <w:szCs w:val="24"/>
+          <w:lang w:val="en-IN" w:eastAsia="en-IN"/>
+        </w:rPr>
+        <w:t>, 7th ed. Boston, MA, USA: Pearson, 2016.</w:t>
+      </w:r>
+    </w:p>
+    <w:p>
+      <w:pPr>
+        <w:spacing w:before="100" w:beforeAutospacing="1" w:after="100" w:afterAutospacing="1" w:line="240" w:lineRule="auto"/>
+        <w:jc w:val="left"/>
+        <w:rPr>
+          <w:color w:val="auto"/>
+          <w:szCs w:val="24"/>
+          <w:lang w:val="en-IN" w:eastAsia="en-IN"/>
+        </w:rPr>
+      </w:pPr>
+      <w:r>
+        <w:rPr>
+          <w:color w:val="auto"/>
+          <w:szCs w:val="24"/>
+          <w:lang w:val="en-IN" w:eastAsia="en-IN"/>
+        </w:rPr>
+        <w:t xml:space="preserve">[3] R. Ramakrishnan and J. Gehrke, </w:t>
+      </w:r>
+      <w:r>
+        <w:rPr>
+          <w:i/>
+          <w:iCs/>
+          <w:color w:val="auto"/>
+          <w:szCs w:val="24"/>
+          <w:lang w:val="en-IN" w:eastAsia="en-IN"/>
+        </w:rPr>
+        <w:t>Database Management Systems</w:t>
+      </w:r>
+      <w:r>
+        <w:rPr>
+          <w:color w:val="auto"/>
+          <w:szCs w:val="24"/>
+          <w:lang w:val="en-IN" w:eastAsia="en-IN"/>
+        </w:rPr>
+        <w:t>, 3rd ed. New York, NY, USA: McGraw-Hill, 2003.</w:t>
+      </w:r>
+    </w:p>
+    <w:p>
+      <w:pPr>
+        <w:spacing w:before="100" w:beforeAutospacing="1" w:after="100" w:afterAutospacing="1" w:line="240" w:lineRule="auto"/>
+        <w:jc w:val="left"/>
         <w:rPr>
           <w:b/>
+          <w:bCs/>
+          <w:color w:val="auto"/>
+          <w:sz w:val="36"/>
+          <w:szCs w:val="36"/>
+          <w:lang w:val="en-IN" w:eastAsia="en-IN"/>
         </w:rPr>
-        <w:t>R1:</w:t>
-      </w:r>
-      <w:r>
-        <w:t xml:space="preserve"> Oracle, </w:t>
-      </w:r>
-      <w:hyperlink r:id="rId15">
-        <w:r>
-          <w:t>MySQL8.4 InnoDB Transaction Model</w:t>
+      </w:pPr>
+      <w:r>
+        <w:rPr>
+          <w:color w:val="auto"/>
+          <w:szCs w:val="24"/>
+          <w:lang w:val="en-IN" w:eastAsia="en-IN"/>
+        </w:rPr>
+        <w:t xml:space="preserve">[4] J. Gray and A. Reuter, </w:t>
+      </w:r>
+      <w:r>
+        <w:rPr>
+          <w:i/>
+          <w:iCs/>
+          <w:color w:val="auto"/>
+          <w:szCs w:val="24"/>
+          <w:lang w:val="en-IN" w:eastAsia="en-IN"/>
+        </w:rPr>
+        <w:t>Transaction Processing: Concepts and Techniques</w:t>
+      </w:r>
+      <w:r>
+        <w:rPr>
+          <w:color w:val="auto"/>
+          <w:szCs w:val="24"/>
+          <w:lang w:val="en-IN" w:eastAsia="en-IN"/>
+        </w:rPr>
+        <w:t>. San Francisco, CA, USA: Morgan Kaufmann, 1992.</w:t>
+      </w:r>
+    </w:p>
+    <w:p>
+      <w:pPr>
+        <w:spacing w:before="100" w:beforeAutospacing="1" w:after="100" w:afterAutospacing="1" w:line="240" w:lineRule="auto"/>
+        <w:jc w:val="left"/>
+        <w:rPr>
+          <w:color w:val="auto"/>
+          <w:szCs w:val="24"/>
+          <w:lang w:val="en-IN" w:eastAsia="en-IN"/>
+        </w:rPr>
+      </w:pPr>
+      <w:r>
+        <w:rPr>
+          <w:color w:val="auto"/>
+          <w:szCs w:val="24"/>
+          <w:lang w:val="en-IN" w:eastAsia="en-IN"/>
+        </w:rPr>
+        <w:t xml:space="preserve">[5] R. J. Bolton and D. J. Hand, “Statistical Fraud Detection: A Review,” </w:t>
+      </w:r>
+      <w:r>
+        <w:rPr>
+          <w:i/>
+          <w:iCs/>
+          <w:color w:val="auto"/>
+          <w:szCs w:val="24"/>
+          <w:lang w:val="en-IN" w:eastAsia="en-IN"/>
+        </w:rPr>
+        <w:t>Statistical Science</w:t>
+      </w:r>
+      <w:r>
+        <w:rPr>
+          <w:color w:val="auto"/>
+          <w:szCs w:val="24"/>
+          <w:lang w:val="en-IN" w:eastAsia="en-IN"/>
+        </w:rPr>
+        <w:t xml:space="preserve">, vol. 17, no. 3, pp. 235–255, 2002. </w:t>
+      </w:r>
+      <w:hyperlink r:id="rId15" w:history="1">
+        <w:r>
+          <w:rPr>
+            <w:color w:val="0000FF"/>
+            <w:szCs w:val="24"/>
+            <w:u w:val="single"/>
+            <w:lang w:val="en-IN" w:eastAsia="en-IN"/>
+          </w:rPr>
+          <w:t>https://doi.org/10.1214/ss/1042727940</w:t>
         </w:r>
       </w:hyperlink>
-      <w:r>
-        <w:t>.</w:t>
-      </w:r>
-    </w:p>
-    <w:p>
-      <w:pPr>
-        <w:pStyle w:val="ListBullet"/>
-      </w:pPr>
-      <w:r>
+    </w:p>
+    <w:p>
+      <w:pPr>
+        <w:spacing w:before="100" w:beforeAutospacing="1" w:after="100" w:afterAutospacing="1" w:line="240" w:lineRule="auto"/>
+        <w:jc w:val="left"/>
+        <w:rPr>
+          <w:color w:val="auto"/>
+          <w:szCs w:val="24"/>
+          <w:lang w:val="en-IN" w:eastAsia="en-IN"/>
+        </w:rPr>
+      </w:pPr>
+      <w:r>
+        <w:rPr>
+          <w:color w:val="auto"/>
+          <w:szCs w:val="24"/>
+          <w:lang w:val="en-IN" w:eastAsia="en-IN"/>
+        </w:rPr>
+        <w:t xml:space="preserve">[6] V. Chandola, A. Banerjee, and V. Kumar, “Anomaly Detection: A Survey,” </w:t>
+      </w:r>
+      <w:r>
+        <w:rPr>
+          <w:i/>
+          <w:iCs/>
+          <w:color w:val="auto"/>
+          <w:szCs w:val="24"/>
+          <w:lang w:val="en-IN" w:eastAsia="en-IN"/>
+        </w:rPr>
+        <w:t>ACM Computing Surveys</w:t>
+      </w:r>
+      <w:r>
+        <w:rPr>
+          <w:color w:val="auto"/>
+          <w:szCs w:val="24"/>
+          <w:lang w:val="en-IN" w:eastAsia="en-IN"/>
+        </w:rPr>
+        <w:t xml:space="preserve">, vol. 41, no. 3, Article 15, 2009. </w:t>
+      </w:r>
+      <w:hyperlink r:id="rId16" w:history="1">
+        <w:r>
+          <w:rPr>
+            <w:color w:val="0000FF"/>
+            <w:szCs w:val="24"/>
+            <w:u w:val="single"/>
+            <w:lang w:val="en-IN" w:eastAsia="en-IN"/>
+          </w:rPr>
+          <w:t>https://doi.org/10.1145/1541880.1541882</w:t>
+        </w:r>
+      </w:hyperlink>
+    </w:p>
+    <w:p>
+      <w:pPr>
+        <w:spacing w:before="100" w:beforeAutospacing="1" w:after="100" w:afterAutospacing="1" w:line="240" w:lineRule="auto"/>
+        <w:jc w:val="left"/>
         <w:rPr>
           <w:b/>
+          <w:bCs/>
+          <w:color w:val="auto"/>
+          <w:sz w:val="36"/>
+          <w:szCs w:val="36"/>
+          <w:lang w:val="en-IN" w:eastAsia="en-IN"/>
         </w:rPr>
-        <w:t>R2:</w:t>
-      </w:r>
-      <w:r>
-        <w:t xml:space="preserve"> Oracle, </w:t>
-      </w:r>
-      <w:hyperlink r:id="rId16">
-        <w:r>
-          <w:t>Deadlocks in InnoDB</w:t>
+      </w:pPr>
+      <w:r>
+        <w:rPr>
+          <w:color w:val="auto"/>
+          <w:szCs w:val="24"/>
+          <w:lang w:val="en-IN" w:eastAsia="en-IN"/>
+        </w:rPr>
+        <w:lastRenderedPageBreak/>
+        <w:t xml:space="preserve">[7] P. G. Selinger, M. M. </w:t>
+      </w:r>
+      <w:proofErr w:type="spellStart"/>
+      <w:r>
+        <w:rPr>
+          <w:color w:val="auto"/>
+          <w:szCs w:val="24"/>
+          <w:lang w:val="en-IN" w:eastAsia="en-IN"/>
+        </w:rPr>
+        <w:t>Astrahan</w:t>
+      </w:r>
+      <w:proofErr w:type="spellEnd"/>
+      <w:r>
+        <w:rPr>
+          <w:color w:val="auto"/>
+          <w:szCs w:val="24"/>
+          <w:lang w:val="en-IN" w:eastAsia="en-IN"/>
+        </w:rPr>
+        <w:t xml:space="preserve">, D. D. Chamberlin, R. A. Lorie, and T. G. Price, “Access Path Selection in a Relational Database Management System,” in </w:t>
+      </w:r>
+      <w:r>
+        <w:rPr>
+          <w:i/>
+          <w:iCs/>
+          <w:color w:val="auto"/>
+          <w:szCs w:val="24"/>
+          <w:lang w:val="en-IN" w:eastAsia="en-IN"/>
+        </w:rPr>
+        <w:t>Proceedings of the 1979 ACM SIGMOD International Conference on Management of Data</w:t>
+      </w:r>
+      <w:r>
+        <w:rPr>
+          <w:color w:val="auto"/>
+          <w:szCs w:val="24"/>
+          <w:lang w:val="en-IN" w:eastAsia="en-IN"/>
+        </w:rPr>
+        <w:t xml:space="preserve">, pp. 23–34, 1979. </w:t>
+      </w:r>
+      <w:hyperlink r:id="rId17" w:history="1">
+        <w:r>
+          <w:rPr>
+            <w:color w:val="0000FF"/>
+            <w:szCs w:val="24"/>
+            <w:u w:val="single"/>
+            <w:lang w:val="en-IN" w:eastAsia="en-IN"/>
+          </w:rPr>
+          <w:t>https://doi.org/10.1145/582095.582099</w:t>
         </w:r>
       </w:hyperlink>
-      <w:r>
-        <w:t>.</w:t>
-      </w:r>
-    </w:p>
-    <w:p>
-      <w:pPr>
-        <w:pStyle w:val="ListBullet"/>
-      </w:pPr>
-      <w:r>
+    </w:p>
+    <w:p>
+      <w:pPr>
+        <w:spacing w:before="100" w:beforeAutospacing="1" w:after="100" w:afterAutospacing="1" w:line="240" w:lineRule="auto"/>
+        <w:jc w:val="left"/>
         <w:rPr>
-          <w:b/>
+          <w:color w:val="auto"/>
+          <w:szCs w:val="24"/>
+          <w:lang w:val="en-IN" w:eastAsia="en-IN"/>
         </w:rPr>
-        <w:t>R3:</w:t>
-      </w:r>
-      <w:r>
-        <w:t xml:space="preserve"> Oracle, </w:t>
-      </w:r>
-      <w:hyperlink r:id="rId17">
-        <w:r>
-          <w:t>Trigger Syntax and Examples</w:t>
+      </w:pPr>
+      <w:r>
+        <w:rPr>
+          <w:color w:val="auto"/>
+          <w:szCs w:val="24"/>
+          <w:lang w:val="en-IN" w:eastAsia="en-IN"/>
+        </w:rPr>
+        <w:t xml:space="preserve">[8] Oracle Corporation, </w:t>
+      </w:r>
+      <w:r>
+        <w:rPr>
+          <w:i/>
+          <w:iCs/>
+          <w:color w:val="auto"/>
+          <w:szCs w:val="24"/>
+          <w:lang w:val="en-IN" w:eastAsia="en-IN"/>
+        </w:rPr>
+        <w:t>MySQL 8.4 Reference Manual</w:t>
+      </w:r>
+      <w:r>
+        <w:rPr>
+          <w:color w:val="auto"/>
+          <w:szCs w:val="24"/>
+          <w:lang w:val="en-IN" w:eastAsia="en-IN"/>
+        </w:rPr>
+        <w:t xml:space="preserve">. Available: </w:t>
+      </w:r>
+      <w:hyperlink r:id="rId18" w:history="1">
+        <w:r>
+          <w:rPr>
+            <w:color w:val="0000FF"/>
+            <w:szCs w:val="24"/>
+            <w:u w:val="single"/>
+            <w:lang w:val="en-IN" w:eastAsia="en-IN"/>
+          </w:rPr>
+          <w:t>https://dev.mysql.com/doc/refman/8.4/en/</w:t>
         </w:r>
       </w:hyperlink>
-      <w:r>
-        <w:t>.</w:t>
-      </w:r>
-    </w:p>
-    <w:p>
-      <w:pPr>
-        <w:pStyle w:val="ListBullet"/>
-      </w:pPr>
-      <w:r>
+    </w:p>
+    <w:p>
+      <w:pPr>
+        <w:spacing w:before="100" w:beforeAutospacing="1" w:after="100" w:afterAutospacing="1" w:line="240" w:lineRule="auto"/>
+        <w:jc w:val="left"/>
         <w:rPr>
-          <w:b/>
+          <w:color w:val="auto"/>
+          <w:szCs w:val="24"/>
+          <w:lang w:val="en-IN" w:eastAsia="en-IN"/>
         </w:rPr>
-        <w:t>R4:</w:t>
-      </w:r>
-      <w:r>
-        <w:t xml:space="preserve"> Oracle, </w:t>
-      </w:r>
-      <w:hyperlink r:id="rId18">
-        <w:r>
-          <w:t>Using Roles</w:t>
+      </w:pPr>
+      <w:r>
+        <w:rPr>
+          <w:color w:val="auto"/>
+          <w:szCs w:val="24"/>
+          <w:lang w:val="en-IN" w:eastAsia="en-IN"/>
+        </w:rPr>
+        <w:t xml:space="preserve">[9] Python Software Foundation, </w:t>
+      </w:r>
+      <w:r>
+        <w:rPr>
+          <w:i/>
+          <w:iCs/>
+          <w:color w:val="auto"/>
+          <w:szCs w:val="24"/>
+          <w:lang w:val="en-IN" w:eastAsia="en-IN"/>
+        </w:rPr>
+        <w:t>Python 3.12 Documentation</w:t>
+      </w:r>
+      <w:r>
+        <w:rPr>
+          <w:color w:val="auto"/>
+          <w:szCs w:val="24"/>
+          <w:lang w:val="en-IN" w:eastAsia="en-IN"/>
+        </w:rPr>
+        <w:t xml:space="preserve">. Available: </w:t>
+      </w:r>
+      <w:hyperlink r:id="rId19" w:history="1">
+        <w:r>
+          <w:rPr>
+            <w:color w:val="0000FF"/>
+            <w:szCs w:val="24"/>
+            <w:u w:val="single"/>
+            <w:lang w:val="en-IN" w:eastAsia="en-IN"/>
+          </w:rPr>
+          <w:t>https://docs.python.org/3.12/</w:t>
         </w:r>
       </w:hyperlink>
-      <w:r>
-        <w:t>.</w:t>
-      </w:r>
-    </w:p>
-    <w:p>
-      <w:pPr>
-        <w:pStyle w:val="ListBullet"/>
+    </w:p>
+    <w:p>
+      <w:pPr>
+        <w:pStyle w:val="Heading1"/>
+      </w:pPr>
+      <w:r>
+        <w:t>30. Appendix: setup, execution and evidence</w:t>
+      </w:r>
+      <w:bookmarkEnd w:id="29"/>
+    </w:p>
+    <w:p>
+      <w:pPr>
+        <w:pStyle w:val="Heading2"/>
+      </w:pPr>
+      <w:bookmarkStart w:id="30" w:name="_Toc243431154"/>
+      <w:r>
+        <w:t>A. Windows setup and explicit lifecycle</w:t>
+      </w:r>
+      <w:bookmarkEnd w:id="30"/>
+    </w:p>
+    <w:p>
+      <w:pPr>
+        <w:keepNext/>
+        <w:spacing w:after="40" w:line="240" w:lineRule="auto"/>
+        <w:jc w:val="left"/>
       </w:pPr>
       <w:r>
         <w:rPr>
-          <w:b/>
+          <w:rFonts w:ascii="Consolas" w:eastAsia="Consolas" w:hAnsi="Consolas" w:cs="Consolas"/>
+          <w:sz w:val="18"/>
         </w:rPr>
-        <w:t>R5:</w:t>
-      </w:r>
-      <w:r>
-        <w:t xml:space="preserve"> Python Software Foundation, </w:t>
-      </w:r>
-      <w:hyperlink r:id="rId19">
-        <w:r>
-          <w:t>http.server documentation</w:t>
-        </w:r>
-      </w:hyperlink>
-      <w:r>
-        <w:t>.</w:t>
-      </w:r>
-    </w:p>
-    <w:p>
-      <w:pPr>
-        <w:pStyle w:val="ListBullet"/>
-      </w:pPr>
+        <w:t>$</w:t>
+      </w:r>
+      <w:proofErr w:type="spellStart"/>
       <w:r>
         <w:rPr>
-          <w:b/>
+          <w:rFonts w:ascii="Consolas" w:eastAsia="Consolas" w:hAnsi="Consolas" w:cs="Consolas"/>
+          <w:sz w:val="18"/>
         </w:rPr>
-        <w:t>Project contracts:</w:t>
-      </w:r>
-      <w:r>
-        <w:t xml:space="preserve"> </w:t>
+        <w:t>env:BANK_MYSQL_CNF</w:t>
+      </w:r>
+      <w:proofErr w:type="spellEnd"/>
+      <w:r>
+        <w:rPr>
+          <w:rFonts w:ascii="Consolas" w:eastAsia="Consolas" w:hAnsi="Consolas" w:cs="Consolas"/>
+          <w:sz w:val="18"/>
+        </w:rPr>
+        <w:t xml:space="preserve"> = Join-Path $HOME '.</w:t>
+      </w:r>
+      <w:proofErr w:type="spellStart"/>
+      <w:r>
+        <w:rPr>
+          <w:rFonts w:ascii="Consolas" w:eastAsia="Consolas" w:hAnsi="Consolas" w:cs="Consolas"/>
+          <w:sz w:val="18"/>
+        </w:rPr>
+        <w:t>bank_mysql.cnf</w:t>
+      </w:r>
+      <w:proofErr w:type="spellEnd"/>
+      <w:r>
+        <w:rPr>
+          <w:rFonts w:ascii="Consolas" w:eastAsia="Consolas" w:hAnsi="Consolas" w:cs="Consolas"/>
+          <w:sz w:val="18"/>
+        </w:rPr>
+        <w:t>'</w:t>
+      </w:r>
+    </w:p>
+    <w:p>
+      <w:pPr>
+        <w:keepNext/>
+        <w:spacing w:after="40" w:line="240" w:lineRule="auto"/>
+        <w:jc w:val="left"/>
+      </w:pPr>
+      <w:r>
+        <w:rPr>
+          <w:rFonts w:ascii="Consolas" w:eastAsia="Consolas" w:hAnsi="Consolas" w:cs="Consolas"/>
+          <w:sz w:val="18"/>
+        </w:rPr>
+        <w:t>$</w:t>
+      </w:r>
+      <w:proofErr w:type="spellStart"/>
+      <w:r>
+        <w:rPr>
+          <w:rFonts w:ascii="Consolas" w:eastAsia="Consolas" w:hAnsi="Consolas" w:cs="Consolas"/>
+          <w:sz w:val="18"/>
+        </w:rPr>
+        <w:t>env:BANK_MYSQL_BIN</w:t>
+      </w:r>
+      <w:proofErr w:type="spellEnd"/>
+      <w:r>
+        <w:rPr>
+          <w:rFonts w:ascii="Consolas" w:eastAsia="Consolas" w:hAnsi="Consolas" w:cs="Consolas"/>
+          <w:sz w:val="18"/>
+        </w:rPr>
+        <w:t xml:space="preserve"> = 'C:\Program Files\MySQL\MySQL Server 8.4\bin\mysql.exe'</w:t>
+      </w:r>
+    </w:p>
+    <w:p>
+      <w:pPr>
+        <w:keepNext/>
+        <w:spacing w:after="40" w:line="240" w:lineRule="auto"/>
+        <w:jc w:val="left"/>
+      </w:pPr>
+      <w:r>
+        <w:rPr>
+          <w:rFonts w:ascii="Consolas" w:eastAsia="Consolas" w:hAnsi="Consolas" w:cs="Consolas"/>
+          <w:sz w:val="18"/>
+        </w:rPr>
+        <w:t>$</w:t>
+      </w:r>
+      <w:proofErr w:type="spellStart"/>
+      <w:r>
+        <w:rPr>
+          <w:rFonts w:ascii="Consolas" w:eastAsia="Consolas" w:hAnsi="Consolas" w:cs="Consolas"/>
+          <w:sz w:val="18"/>
+        </w:rPr>
+        <w:t>env:BANK_PYTHON_BIN</w:t>
+      </w:r>
+      <w:proofErr w:type="spellEnd"/>
+      <w:r>
+        <w:rPr>
+          <w:rFonts w:ascii="Consolas" w:eastAsia="Consolas" w:hAnsi="Consolas" w:cs="Consolas"/>
+          <w:sz w:val="18"/>
+        </w:rPr>
+        <w:t xml:space="preserve"> = 'C:\Path To Python\python.exe'</w:t>
+      </w:r>
+    </w:p>
+    <w:p>
+      <w:pPr>
+        <w:keepNext/>
+        <w:spacing w:after="40" w:line="240" w:lineRule="auto"/>
+        <w:jc w:val="left"/>
+      </w:pPr>
+      <w:r>
+        <w:rPr>
+          <w:rFonts w:ascii="Consolas" w:eastAsia="Consolas" w:hAnsi="Consolas" w:cs="Consolas"/>
+          <w:sz w:val="18"/>
+        </w:rPr>
+        <w:t>$env:PYTHONUTF8 = '1'</w:t>
+      </w:r>
+    </w:p>
+    <w:p>
+      <w:pPr>
+        <w:keepNext/>
+        <w:spacing w:after="40" w:line="240" w:lineRule="auto"/>
+        <w:jc w:val="left"/>
+      </w:pPr>
+      <w:proofErr w:type="spellStart"/>
+      <w:r>
+        <w:rPr>
+          <w:rFonts w:ascii="Consolas" w:eastAsia="Consolas" w:hAnsi="Consolas" w:cs="Consolas"/>
+          <w:sz w:val="18"/>
+        </w:rPr>
+        <w:t>powershell</w:t>
+      </w:r>
+      <w:proofErr w:type="spellEnd"/>
+      <w:r>
+        <w:rPr>
+          <w:rFonts w:ascii="Consolas" w:eastAsia="Consolas" w:hAnsi="Consolas" w:cs="Consolas"/>
+          <w:sz w:val="18"/>
+        </w:rPr>
+        <w:t xml:space="preserve"> -</w:t>
+      </w:r>
+      <w:proofErr w:type="spellStart"/>
+      <w:r>
+        <w:rPr>
+          <w:rFonts w:ascii="Consolas" w:eastAsia="Consolas" w:hAnsi="Consolas" w:cs="Consolas"/>
+          <w:sz w:val="18"/>
+        </w:rPr>
+        <w:t>NoProfile</w:t>
+      </w:r>
+      <w:proofErr w:type="spellEnd"/>
+      <w:r>
+        <w:rPr>
+          <w:rFonts w:ascii="Consolas" w:eastAsia="Consolas" w:hAnsi="Consolas" w:cs="Consolas"/>
+          <w:sz w:val="18"/>
+        </w:rPr>
+        <w:t xml:space="preserve"> -File demo/start_demo.ps1 -</w:t>
+      </w:r>
+      <w:proofErr w:type="spellStart"/>
+      <w:r>
+        <w:rPr>
+          <w:rFonts w:ascii="Consolas" w:eastAsia="Consolas" w:hAnsi="Consolas" w:cs="Consolas"/>
+          <w:sz w:val="18"/>
+        </w:rPr>
+        <w:t>SessionFile</w:t>
+      </w:r>
+      <w:proofErr w:type="spellEnd"/>
+      <w:r>
+        <w:rPr>
+          <w:rFonts w:ascii="Consolas" w:eastAsia="Consolas" w:hAnsi="Consolas" w:cs="Consolas"/>
+          <w:sz w:val="18"/>
+        </w:rPr>
+        <w:t xml:space="preserve"> demo/out/dashboard-</w:t>
+      </w:r>
+      <w:proofErr w:type="spellStart"/>
+      <w:r>
+        <w:rPr>
+          <w:rFonts w:ascii="Consolas" w:eastAsia="Consolas" w:hAnsi="Consolas" w:cs="Consolas"/>
+          <w:sz w:val="18"/>
+        </w:rPr>
+        <w:t>session.json</w:t>
+      </w:r>
+      <w:proofErr w:type="spellEnd"/>
+    </w:p>
+    <w:p>
+      <w:pPr>
+        <w:keepNext/>
+        <w:spacing w:after="40" w:line="240" w:lineRule="auto"/>
+        <w:jc w:val="left"/>
+      </w:pPr>
+      <w:proofErr w:type="spellStart"/>
+      <w:r>
+        <w:rPr>
+          <w:rFonts w:ascii="Consolas" w:eastAsia="Consolas" w:hAnsi="Consolas" w:cs="Consolas"/>
+          <w:sz w:val="18"/>
+        </w:rPr>
+        <w:t>powershell</w:t>
+      </w:r>
+      <w:proofErr w:type="spellEnd"/>
+      <w:r>
+        <w:rPr>
+          <w:rFonts w:ascii="Consolas" w:eastAsia="Consolas" w:hAnsi="Consolas" w:cs="Consolas"/>
+          <w:sz w:val="18"/>
+        </w:rPr>
+        <w:t xml:space="preserve"> -</w:t>
+      </w:r>
+      <w:proofErr w:type="spellStart"/>
+      <w:r>
+        <w:rPr>
+          <w:rFonts w:ascii="Consolas" w:eastAsia="Consolas" w:hAnsi="Consolas" w:cs="Consolas"/>
+          <w:sz w:val="18"/>
+        </w:rPr>
+        <w:t>NoProfile</w:t>
+      </w:r>
+      <w:proofErr w:type="spellEnd"/>
+      <w:r>
+        <w:rPr>
+          <w:rFonts w:ascii="Consolas" w:eastAsia="Consolas" w:hAnsi="Consolas" w:cs="Consolas"/>
+          <w:sz w:val="18"/>
+        </w:rPr>
+        <w:t xml:space="preserve"> -File demo/start_dashboard.ps1 -</w:t>
+      </w:r>
+      <w:proofErr w:type="spellStart"/>
+      <w:r>
+        <w:rPr>
+          <w:rFonts w:ascii="Consolas" w:eastAsia="Consolas" w:hAnsi="Consolas" w:cs="Consolas"/>
+          <w:sz w:val="18"/>
+        </w:rPr>
+        <w:t>SessionFile</w:t>
+      </w:r>
+      <w:proofErr w:type="spellEnd"/>
+      <w:r>
+        <w:rPr>
+          <w:rFonts w:ascii="Consolas" w:eastAsia="Consolas" w:hAnsi="Consolas" w:cs="Consolas"/>
+          <w:sz w:val="18"/>
+        </w:rPr>
+        <w:t xml:space="preserve"> demo/out/dashboard-</w:t>
+      </w:r>
+      <w:proofErr w:type="spellStart"/>
+      <w:r>
+        <w:rPr>
+          <w:rFonts w:ascii="Consolas" w:eastAsia="Consolas" w:hAnsi="Consolas" w:cs="Consolas"/>
+          <w:sz w:val="18"/>
+        </w:rPr>
+        <w:t>session.json</w:t>
+      </w:r>
+      <w:proofErr w:type="spellEnd"/>
+    </w:p>
+    <w:p>
+      <w:pPr>
+        <w:keepNext/>
+        <w:spacing w:after="40" w:line="240" w:lineRule="auto"/>
+        <w:jc w:val="left"/>
+      </w:pPr>
+      <w:r>
+        <w:rPr>
+          <w:rFonts w:ascii="Consolas" w:eastAsia="Consolas" w:hAnsi="Consolas" w:cs="Consolas"/>
+          <w:sz w:val="18"/>
+        </w:rPr>
+        <w:t xml:space="preserve"># Open http://127.0.0.1:5000. Stop only the dashboard with </w:t>
+      </w:r>
+      <w:proofErr w:type="spellStart"/>
+      <w:r>
+        <w:rPr>
+          <w:rFonts w:ascii="Consolas" w:eastAsia="Consolas" w:hAnsi="Consolas" w:cs="Consolas"/>
+          <w:sz w:val="18"/>
+        </w:rPr>
+        <w:t>Ctrl+C</w:t>
+      </w:r>
+      <w:proofErr w:type="spellEnd"/>
+      <w:r>
+        <w:rPr>
+          <w:rFonts w:ascii="Consolas" w:eastAsia="Consolas" w:hAnsi="Consolas" w:cs="Consolas"/>
+          <w:sz w:val="18"/>
+        </w:rPr>
+        <w:t xml:space="preserve"> when finished.</w:t>
+      </w:r>
+    </w:p>
+    <w:p>
+      <w:pPr>
+        <w:spacing w:after="40" w:line="240" w:lineRule="auto"/>
+        <w:jc w:val="left"/>
+      </w:pPr>
+      <w:proofErr w:type="spellStart"/>
+      <w:r>
+        <w:rPr>
+          <w:rFonts w:ascii="Consolas" w:eastAsia="Consolas" w:hAnsi="Consolas" w:cs="Consolas"/>
+          <w:sz w:val="18"/>
+        </w:rPr>
+        <w:t>powershell</w:t>
+      </w:r>
+      <w:proofErr w:type="spellEnd"/>
+      <w:r>
+        <w:rPr>
+          <w:rFonts w:ascii="Consolas" w:eastAsia="Consolas" w:hAnsi="Consolas" w:cs="Consolas"/>
+          <w:sz w:val="18"/>
+        </w:rPr>
+        <w:t xml:space="preserve"> -</w:t>
+      </w:r>
+      <w:proofErr w:type="spellStart"/>
+      <w:r>
+        <w:rPr>
+          <w:rFonts w:ascii="Consolas" w:eastAsia="Consolas" w:hAnsi="Consolas" w:cs="Consolas"/>
+          <w:sz w:val="18"/>
+        </w:rPr>
+        <w:t>NoProfile</w:t>
+      </w:r>
+      <w:proofErr w:type="spellEnd"/>
+      <w:r>
+        <w:rPr>
+          <w:rFonts w:ascii="Consolas" w:eastAsia="Consolas" w:hAnsi="Consolas" w:cs="Consolas"/>
+          <w:sz w:val="18"/>
+        </w:rPr>
+        <w:t xml:space="preserve"> -File demo/start_demo.ps1 -Action Stop -</w:t>
+      </w:r>
+      <w:proofErr w:type="spellStart"/>
+      <w:r>
+        <w:rPr>
+          <w:rFonts w:ascii="Consolas" w:eastAsia="Consolas" w:hAnsi="Consolas" w:cs="Consolas"/>
+          <w:sz w:val="18"/>
+        </w:rPr>
+        <w:t>SessionFile</w:t>
+      </w:r>
+      <w:proofErr w:type="spellEnd"/>
+      <w:r>
+        <w:rPr>
+          <w:rFonts w:ascii="Consolas" w:eastAsia="Consolas" w:hAnsi="Consolas" w:cs="Consolas"/>
+          <w:sz w:val="18"/>
+        </w:rPr>
+        <w:t xml:space="preserve"> demo/out/dashboard-</w:t>
+      </w:r>
+      <w:proofErr w:type="spellStart"/>
+      <w:r>
+        <w:rPr>
+          <w:rFonts w:ascii="Consolas" w:eastAsia="Consolas" w:hAnsi="Consolas" w:cs="Consolas"/>
+          <w:sz w:val="18"/>
+        </w:rPr>
+        <w:t>session.json</w:t>
+      </w:r>
+      <w:proofErr w:type="spellEnd"/>
+    </w:p>
+    <w:p>
+      <w:r>
+        <w:t>Keep actual credentials outside the repository. The native client option file uses a private [client] section. No password is embedded in the commands or HTML. Use a new session filename for another run; do not delete historical evidence to reuse one. Start/Stop are explicit shell operations, never HTTP endpoints.</w:t>
+      </w:r>
+    </w:p>
+    <w:p>
+      <w:pPr>
+        <w:pStyle w:val="Heading2"/>
+      </w:pPr>
+      <w:bookmarkStart w:id="31" w:name="_Toc243431155"/>
+      <w:r>
+        <w:t>B. Focused dashboard tests</w:t>
+      </w:r>
+      <w:bookmarkEnd w:id="31"/>
+    </w:p>
+    <w:p>
+      <w:pPr>
+        <w:keepNext/>
+        <w:spacing w:after="40" w:line="240" w:lineRule="auto"/>
+        <w:jc w:val="left"/>
+      </w:pPr>
+      <w:r>
+        <w:rPr>
+          <w:rFonts w:ascii="Consolas" w:eastAsia="Consolas" w:hAnsi="Consolas" w:cs="Consolas"/>
+          <w:sz w:val="18"/>
+        </w:rPr>
+        <w:t>&amp; $</w:t>
+      </w:r>
+      <w:proofErr w:type="spellStart"/>
+      <w:r>
+        <w:rPr>
+          <w:rFonts w:ascii="Consolas" w:eastAsia="Consolas" w:hAnsi="Consolas" w:cs="Consolas"/>
+          <w:sz w:val="18"/>
+        </w:rPr>
+        <w:t>env:BANK_PYTHON_BIN</w:t>
+      </w:r>
+      <w:proofErr w:type="spellEnd"/>
+      <w:r>
+        <w:rPr>
+          <w:rFonts w:ascii="Consolas" w:eastAsia="Consolas" w:hAnsi="Consolas" w:cs="Consolas"/>
+          <w:sz w:val="18"/>
+        </w:rPr>
+        <w:t xml:space="preserve"> -m </w:t>
+      </w:r>
+      <w:proofErr w:type="spellStart"/>
+      <w:r>
+        <w:rPr>
+          <w:rFonts w:ascii="Consolas" w:eastAsia="Consolas" w:hAnsi="Consolas" w:cs="Consolas"/>
+          <w:sz w:val="18"/>
+        </w:rPr>
+        <w:t>unittest</w:t>
+      </w:r>
+      <w:proofErr w:type="spellEnd"/>
+      <w:r>
+        <w:rPr>
+          <w:rFonts w:ascii="Consolas" w:eastAsia="Consolas" w:hAnsi="Consolas" w:cs="Consolas"/>
+          <w:sz w:val="18"/>
+        </w:rPr>
+        <w:t xml:space="preserve"> discover -s tests/dashboard -p 'test_*.</w:t>
+      </w:r>
+      <w:proofErr w:type="spellStart"/>
+      <w:r>
+        <w:rPr>
+          <w:rFonts w:ascii="Consolas" w:eastAsia="Consolas" w:hAnsi="Consolas" w:cs="Consolas"/>
+          <w:sz w:val="18"/>
+        </w:rPr>
+        <w:t>py</w:t>
+      </w:r>
+      <w:proofErr w:type="spellEnd"/>
+      <w:r>
+        <w:rPr>
+          <w:rFonts w:ascii="Consolas" w:eastAsia="Consolas" w:hAnsi="Consolas" w:cs="Consolas"/>
+          <w:sz w:val="18"/>
+        </w:rPr>
+        <w:t>'</w:t>
+      </w:r>
+    </w:p>
+    <w:p>
+      <w:pPr>
+        <w:keepNext/>
+        <w:spacing w:after="40" w:line="240" w:lineRule="auto"/>
+        <w:jc w:val="left"/>
+      </w:pPr>
+      <w:r>
+        <w:rPr>
+          <w:rFonts w:ascii="Consolas" w:eastAsia="Consolas" w:hAnsi="Consolas" w:cs="Consolas"/>
+          <w:sz w:val="18"/>
+        </w:rPr>
+        <w:t># With a fresh owned dashboard already running:</w:t>
+      </w:r>
+    </w:p>
+    <w:p>
+      <w:pPr>
+        <w:keepNext/>
+        <w:spacing w:after="40" w:line="240" w:lineRule="auto"/>
+        <w:jc w:val="left"/>
+      </w:pPr>
+      <w:r>
+        <w:rPr>
+          <w:rFonts w:ascii="Consolas" w:eastAsia="Consolas" w:hAnsi="Consolas" w:cs="Consolas"/>
+          <w:sz w:val="18"/>
+        </w:rPr>
+        <w:t>&amp; $</w:t>
+      </w:r>
+      <w:proofErr w:type="spellStart"/>
+      <w:r>
+        <w:rPr>
+          <w:rFonts w:ascii="Consolas" w:eastAsia="Consolas" w:hAnsi="Consolas" w:cs="Consolas"/>
+          <w:sz w:val="18"/>
+        </w:rPr>
+        <w:t>env:BANK_PYTHON_BIN</w:t>
+      </w:r>
+      <w:proofErr w:type="spellEnd"/>
+      <w:r>
+        <w:rPr>
+          <w:rFonts w:ascii="Consolas" w:eastAsia="Consolas" w:hAnsi="Consolas" w:cs="Consolas"/>
+          <w:sz w:val="18"/>
+        </w:rPr>
+        <w:t xml:space="preserve"> tests/dashboard/live_dashboard.py `</w:t>
+      </w:r>
+    </w:p>
+    <w:p>
+      <w:pPr>
+        <w:keepNext/>
+        <w:spacing w:after="40" w:line="240" w:lineRule="auto"/>
+        <w:jc w:val="left"/>
+      </w:pPr>
+      <w:r>
+        <w:rPr>
+          <w:rFonts w:ascii="Consolas" w:eastAsia="Consolas" w:hAnsi="Consolas" w:cs="Consolas"/>
+          <w:sz w:val="18"/>
+        </w:rPr>
+        <w:t xml:space="preserve">  --evidence-</w:t>
+      </w:r>
+      <w:proofErr w:type="spellStart"/>
+      <w:r>
+        <w:rPr>
+          <w:rFonts w:ascii="Consolas" w:eastAsia="Consolas" w:hAnsi="Consolas" w:cs="Consolas"/>
+          <w:sz w:val="18"/>
+        </w:rPr>
+        <w:t>dir</w:t>
+      </w:r>
+      <w:proofErr w:type="spellEnd"/>
+      <w:r>
+        <w:rPr>
+          <w:rFonts w:ascii="Consolas" w:eastAsia="Consolas" w:hAnsi="Consolas" w:cs="Consolas"/>
+          <w:sz w:val="18"/>
+        </w:rPr>
+        <w:t xml:space="preserve"> evidence/reviews/final-dashboard/my-new-http-run</w:t>
+      </w:r>
+    </w:p>
+    <w:p>
+      <w:pPr>
+        <w:keepNext/>
+        <w:spacing w:after="40" w:line="240" w:lineRule="auto"/>
+        <w:jc w:val="left"/>
+      </w:pPr>
+      <w:r>
+        <w:rPr>
+          <w:rFonts w:ascii="Consolas" w:eastAsia="Consolas" w:hAnsi="Consolas" w:cs="Consolas"/>
+          <w:sz w:val="18"/>
+        </w:rPr>
+        <w:t># Optional: installed Edge + Playwright available on NODE_PATH:</w:t>
+      </w:r>
+    </w:p>
+    <w:p>
+      <w:pPr>
+        <w:spacing w:after="40" w:line="240" w:lineRule="auto"/>
+        <w:jc w:val="left"/>
+      </w:pPr>
+      <w:r>
+        <w:rPr>
+          <w:rFonts w:ascii="Consolas" w:eastAsia="Consolas" w:hAnsi="Consolas" w:cs="Consolas"/>
+          <w:sz w:val="18"/>
+        </w:rPr>
+        <w:t>node tests/dashboard/</w:t>
+      </w:r>
+      <w:proofErr w:type="spellStart"/>
+      <w:r>
+        <w:rPr>
+          <w:rFonts w:ascii="Consolas" w:eastAsia="Consolas" w:hAnsi="Consolas" w:cs="Consolas"/>
+          <w:sz w:val="18"/>
+        </w:rPr>
+        <w:t>browser_smoke.cjs</w:t>
+      </w:r>
+      <w:proofErr w:type="spellEnd"/>
+      <w:r>
+        <w:rPr>
+          <w:rFonts w:ascii="Consolas" w:eastAsia="Consolas" w:hAnsi="Consolas" w:cs="Consolas"/>
+          <w:sz w:val="18"/>
+        </w:rPr>
+        <w:t xml:space="preserve"> evidence/reviews/final-dashboard/my-new-browser-run</w:t>
+      </w:r>
+    </w:p>
+    <w:p>
+      <w:r>
+        <w:t xml:space="preserve">Test output directories must be new, preserving historical results. The live runner has no arbitrary SQL or protected-database option. Always stop the server and invoke ownership-checked Stop after testing. The prior full safe SQL/CLI orchestrator remains </w:t>
       </w:r>
       <w:r>
         <w:rPr>
           <w:rFonts w:ascii="Consolas" w:eastAsia="Consolas" w:hAnsi="Consolas" w:cs="Consolas"/>
           <w:sz w:val="20"/>
         </w:rPr>
-        <w:t>docs/member-a/SPEC.md</w:t>
-      </w:r>
-      <w:r>
-        <w:t xml:space="preserve">, </w:t>
+        <w:t>tests/demo/verify_all.ps1</w:t>
+      </w:r>
+      <w:r>
+        <w:t>; it was not rerun for unchanged production SQL in this GUI delivery.</w:t>
+      </w:r>
+    </w:p>
+    <w:p>
+      <w:pPr>
+        <w:pStyle w:val="Heading2"/>
+      </w:pPr>
+      <w:bookmarkStart w:id="32" w:name="_Toc243431156"/>
+      <w:r>
+        <w:lastRenderedPageBreak/>
+        <w:t>C. Evidence map</w:t>
+      </w:r>
+      <w:bookmarkEnd w:id="32"/>
+    </w:p>
+    <w:p>
+      <w:pPr>
+        <w:pStyle w:val="ListBullet"/>
+      </w:pPr>
+      <w:r>
+        <w:t xml:space="preserve">New HTTP assertions/results: </w:t>
       </w:r>
       <w:r>
         <w:rPr>
           <w:rFonts w:ascii="Consolas" w:eastAsia="Consolas" w:hAnsi="Consolas" w:cs="Consolas"/>
           <w:sz w:val="20"/>
         </w:rPr>
-        <w:t>docs/decisions.md</w:t>
-      </w:r>
-      <w:r>
-        <w:t xml:space="preserve">, </w:t>
+        <w:t>evidence/reviews/final-dashboard/http-workflow-20261020-1/</w:t>
+      </w:r>
+      <w:r>
+        <w:t>.</w:t>
+      </w:r>
+    </w:p>
+    <w:p>
+      <w:pPr>
+        <w:pStyle w:val="ListBullet"/>
+      </w:pPr>
+      <w:r>
+        <w:t xml:space="preserve">Actual browser assertions/screenshots: </w:t>
       </w:r>
       <w:r>
         <w:rPr>
           <w:rFonts w:ascii="Consolas" w:eastAsia="Consolas" w:hAnsi="Consolas" w:cs="Consolas"/>
           <w:sz w:val="20"/>
         </w:rPr>
-        <w:t>docs/interfaces.md</w:t>
-      </w:r>
-      <w:r>
-        <w:t xml:space="preserve">, </w:t>
-      </w:r>
-      <w:r>
-        <w:rPr>
-          <w:rFonts w:ascii="Consolas" w:eastAsia="Consolas" w:hAnsi="Consolas" w:cs="Consolas"/>
-          <w:sz w:val="20"/>
-        </w:rPr>
-        <w:t>build/file_order.txt</w:t>
+        <w:t>evidence/reviews/final-dashboard/browser-20261020-2/</w:t>
       </w:r>
       <w:r>
         <w:t>.</w:t>
@@ -7185,13 +8408,15 @@
         <w:pStyle w:val="ListBullet"/>
       </w:pPr>
       <w:r>
-        <w:rPr>
-          <w:b/>
-        </w:rPr>
-        <w:t>Implementation evidence:</w:t>
-      </w:r>
-      <w:r>
-        <w:t xml:space="preserve"> </w:t>
+        <w:t>Final six-invariant and cleanup records: see the dashboard implementation report.</w:t>
+      </w:r>
+    </w:p>
+    <w:p>
+      <w:pPr>
+        <w:pStyle w:val="ListBullet"/>
+      </w:pPr>
+      <w:r>
+        <w:t xml:space="preserve">Historical SQL/CLI summary: </w:t>
       </w:r>
       <w:r>
         <w:rPr>
@@ -7201,16 +8426,6 @@
         <w:t>evidence/reviews/final-demo/REPORT.md</w:t>
       </w:r>
       <w:r>
-        <w:t xml:space="preserve"> and </w:t>
-      </w:r>
-      <w:r>
-        <w:rPr>
-          <w:rFonts w:ascii="Consolas" w:eastAsia="Consolas" w:hAnsi="Consolas" w:cs="Consolas"/>
-          <w:sz w:val="20"/>
-        </w:rPr>
-        <w:t>evidence/reviews/final-dashboard/REPORT.md</w:t>
-      </w:r>
-      <w:r>
         <w:t>.</w:t>
       </w:r>
     </w:p>
@@ -7219,338 +8434,6 @@
         <w:pStyle w:val="ListBullet"/>
       </w:pPr>
       <w:r>
-        <w:rPr>
-          <w:b/>
-        </w:rPr>
-        <w:lastRenderedPageBreak/>
-        <w:t>Source:</w:t>
-      </w:r>
-      <w:r>
-        <w:t xml:space="preserve"> this repository's schema/, functions/, procedures/, triggers/, views/, security/ and indexes/.</w:t>
-      </w:r>
-    </w:p>
-    <w:p>
-      <w:pPr>
-        <w:pStyle w:val="Heading1"/>
-      </w:pPr>
-      <w:bookmarkStart w:id="29" w:name="_Toc243431153"/>
-      <w:r>
-        <w:t>30. Appendix: setup, execution and evidence</w:t>
-      </w:r>
-      <w:bookmarkEnd w:id="29"/>
-    </w:p>
-    <w:p>
-      <w:pPr>
-        <w:pStyle w:val="Heading2"/>
-      </w:pPr>
-      <w:bookmarkStart w:id="30" w:name="_Toc243431154"/>
-      <w:r>
-        <w:t>A. Windows setup and explicit lifecycle</w:t>
-      </w:r>
-      <w:bookmarkEnd w:id="30"/>
-    </w:p>
-    <w:p>
-      <w:pPr>
-        <w:keepNext/>
-        <w:spacing w:after="40" w:line="240" w:lineRule="auto"/>
-        <w:jc w:val="left"/>
-      </w:pPr>
-      <w:r>
-        <w:rPr>
-          <w:rFonts w:ascii="Consolas" w:eastAsia="Consolas" w:hAnsi="Consolas" w:cs="Consolas"/>
-          <w:sz w:val="18"/>
-        </w:rPr>
-        <w:t>$env:BANK_MYSQL_CNF = Join-Path $HOME '.bank_mysql.cnf'</w:t>
-      </w:r>
-    </w:p>
-    <w:p>
-      <w:pPr>
-        <w:keepNext/>
-        <w:spacing w:after="40" w:line="240" w:lineRule="auto"/>
-        <w:jc w:val="left"/>
-      </w:pPr>
-      <w:r>
-        <w:rPr>
-          <w:rFonts w:ascii="Consolas" w:eastAsia="Consolas" w:hAnsi="Consolas" w:cs="Consolas"/>
-          <w:sz w:val="18"/>
-        </w:rPr>
-        <w:t>$env:BANK_MYSQL_BIN = 'C:\Program Files\MySQL\MySQL Server 8.4\bin\mysql.exe'</w:t>
-      </w:r>
-    </w:p>
-    <w:p>
-      <w:pPr>
-        <w:keepNext/>
-        <w:spacing w:after="40" w:line="240" w:lineRule="auto"/>
-        <w:jc w:val="left"/>
-      </w:pPr>
-      <w:r>
-        <w:rPr>
-          <w:rFonts w:ascii="Consolas" w:eastAsia="Consolas" w:hAnsi="Consolas" w:cs="Consolas"/>
-          <w:sz w:val="18"/>
-        </w:rPr>
-        <w:t>$env:BANK_PYTHON_BIN = 'C:\Path To Python\python.exe'</w:t>
-      </w:r>
-    </w:p>
-    <w:p>
-      <w:pPr>
-        <w:keepNext/>
-        <w:spacing w:after="40" w:line="240" w:lineRule="auto"/>
-        <w:jc w:val="left"/>
-      </w:pPr>
-      <w:r>
-        <w:rPr>
-          <w:rFonts w:ascii="Consolas" w:eastAsia="Consolas" w:hAnsi="Consolas" w:cs="Consolas"/>
-          <w:sz w:val="18"/>
-        </w:rPr>
-        <w:t>$env:PYTHONUTF8 = '1'</w:t>
-      </w:r>
-    </w:p>
-    <w:p>
-      <w:pPr>
-        <w:keepNext/>
-        <w:spacing w:after="40" w:line="240" w:lineRule="auto"/>
-        <w:jc w:val="left"/>
-      </w:pPr>
-      <w:r>
-        <w:rPr>
-          <w:rFonts w:ascii="Consolas" w:eastAsia="Consolas" w:hAnsi="Consolas" w:cs="Consolas"/>
-          <w:sz w:val="18"/>
-        </w:rPr>
-        <w:t>powershell -NoProfile -File demo/start_demo.ps1 -SessionFile demo/out/dashboard-session.json</w:t>
-      </w:r>
-    </w:p>
-    <w:p>
-      <w:pPr>
-        <w:keepNext/>
-        <w:spacing w:after="40" w:line="240" w:lineRule="auto"/>
-        <w:jc w:val="left"/>
-      </w:pPr>
-      <w:r>
-        <w:rPr>
-          <w:rFonts w:ascii="Consolas" w:eastAsia="Consolas" w:hAnsi="Consolas" w:cs="Consolas"/>
-          <w:sz w:val="18"/>
-        </w:rPr>
-        <w:t>powershell -NoProfile -File demo/start_dashboard.ps1 -SessionFile demo/out/dashboard-session.json</w:t>
-      </w:r>
-    </w:p>
-    <w:p>
-      <w:pPr>
-        <w:keepNext/>
-        <w:spacing w:after="40" w:line="240" w:lineRule="auto"/>
-        <w:jc w:val="left"/>
-      </w:pPr>
-      <w:r>
-        <w:rPr>
-          <w:rFonts w:ascii="Consolas" w:eastAsia="Consolas" w:hAnsi="Consolas" w:cs="Consolas"/>
-          <w:sz w:val="18"/>
-        </w:rPr>
-        <w:t># Open http://127.0.0.1:5000. Stop only the dashboard with Ctrl+C when finished.</w:t>
-      </w:r>
-    </w:p>
-    <w:p>
-      <w:pPr>
-        <w:spacing w:after="40" w:line="240" w:lineRule="auto"/>
-        <w:jc w:val="left"/>
-      </w:pPr>
-      <w:r>
-        <w:rPr>
-          <w:rFonts w:ascii="Consolas" w:eastAsia="Consolas" w:hAnsi="Consolas" w:cs="Consolas"/>
-          <w:sz w:val="18"/>
-        </w:rPr>
-        <w:t>powershell -NoProfile -File demo/start_demo.ps1 -Action Stop -SessionFile demo/out/dashboard-session.json</w:t>
-      </w:r>
-    </w:p>
-    <w:p>
-      <w:r>
-        <w:t>Keep actual credentials outside the repository. The native client option file uses a private [client] section. No password is embedded in the commands or HTML. Use a new session filename for another run; do not delete historical evidence to reuse one. Start/Stop are explicit shell operations, never HTTP endpoints.</w:t>
-      </w:r>
-    </w:p>
-    <w:p>
-      <w:pPr>
-        <w:pStyle w:val="Heading2"/>
-      </w:pPr>
-      <w:bookmarkStart w:id="31" w:name="_Toc243431155"/>
-      <w:r>
-        <w:t>B. Focused dashboard tests</w:t>
-      </w:r>
-      <w:bookmarkEnd w:id="31"/>
-    </w:p>
-    <w:p>
-      <w:pPr>
-        <w:keepNext/>
-        <w:spacing w:after="40" w:line="240" w:lineRule="auto"/>
-        <w:jc w:val="left"/>
-      </w:pPr>
-      <w:r>
-        <w:rPr>
-          <w:rFonts w:ascii="Consolas" w:eastAsia="Consolas" w:hAnsi="Consolas" w:cs="Consolas"/>
-          <w:sz w:val="18"/>
-        </w:rPr>
-        <w:t>&amp; $env:BANK_PYTHON_BIN -m unittest discover -s tests/dashboard -p 'test_*.py'</w:t>
-      </w:r>
-    </w:p>
-    <w:p>
-      <w:pPr>
-        <w:keepNext/>
-        <w:spacing w:after="40" w:line="240" w:lineRule="auto"/>
-        <w:jc w:val="left"/>
-      </w:pPr>
-      <w:r>
-        <w:rPr>
-          <w:rFonts w:ascii="Consolas" w:eastAsia="Consolas" w:hAnsi="Consolas" w:cs="Consolas"/>
-          <w:sz w:val="18"/>
-        </w:rPr>
-        <w:t># With a fresh owned dashboard already running:</w:t>
-      </w:r>
-    </w:p>
-    <w:p>
-      <w:pPr>
-        <w:keepNext/>
-        <w:spacing w:after="40" w:line="240" w:lineRule="auto"/>
-        <w:jc w:val="left"/>
-      </w:pPr>
-      <w:r>
-        <w:rPr>
-          <w:rFonts w:ascii="Consolas" w:eastAsia="Consolas" w:hAnsi="Consolas" w:cs="Consolas"/>
-          <w:sz w:val="18"/>
-        </w:rPr>
-        <w:t>&amp; $env:BANK_PYTHON_BIN tests/dashboard/live_dashboard.py `</w:t>
-      </w:r>
-    </w:p>
-    <w:p>
-      <w:pPr>
-        <w:keepNext/>
-        <w:spacing w:after="40" w:line="240" w:lineRule="auto"/>
-        <w:jc w:val="left"/>
-      </w:pPr>
-      <w:r>
-        <w:rPr>
-          <w:rFonts w:ascii="Consolas" w:eastAsia="Consolas" w:hAnsi="Consolas" w:cs="Consolas"/>
-          <w:sz w:val="18"/>
-        </w:rPr>
-        <w:t xml:space="preserve">  --evidence-dir evidence/reviews/final-dashboard/my-new-http-run</w:t>
-      </w:r>
-    </w:p>
-    <w:p>
-      <w:pPr>
-        <w:keepNext/>
-        <w:spacing w:after="40" w:line="240" w:lineRule="auto"/>
-        <w:jc w:val="left"/>
-      </w:pPr>
-      <w:r>
-        <w:rPr>
-          <w:rFonts w:ascii="Consolas" w:eastAsia="Consolas" w:hAnsi="Consolas" w:cs="Consolas"/>
-          <w:sz w:val="18"/>
-        </w:rPr>
-        <w:t># Optional: installed Edge + Playwright available on NODE_PATH:</w:t>
-      </w:r>
-    </w:p>
-    <w:p>
-      <w:pPr>
-        <w:spacing w:after="40" w:line="240" w:lineRule="auto"/>
-        <w:jc w:val="left"/>
-      </w:pPr>
-      <w:r>
-        <w:rPr>
-          <w:rFonts w:ascii="Consolas" w:eastAsia="Consolas" w:hAnsi="Consolas" w:cs="Consolas"/>
-          <w:sz w:val="18"/>
-        </w:rPr>
-        <w:t>node tests/dashboard/browser_smoke.cjs evidence/reviews/final-dashboard/my-new-browser-run</w:t>
-      </w:r>
-    </w:p>
-    <w:p>
-      <w:r>
-        <w:t xml:space="preserve">Test output directories must be new, preserving historical results. The live runner has no arbitrary SQL or protected-database option. Always stop the server and invoke ownership-checked Stop after testing. The prior full safe SQL/CLI orchestrator remains </w:t>
-      </w:r>
-      <w:r>
-        <w:rPr>
-          <w:rFonts w:ascii="Consolas" w:eastAsia="Consolas" w:hAnsi="Consolas" w:cs="Consolas"/>
-          <w:sz w:val="20"/>
-        </w:rPr>
-        <w:t>tests/demo/verify_all.ps1</w:t>
-      </w:r>
-      <w:r>
-        <w:t>; it was not rerun for unchanged production SQL in this GUI delivery.</w:t>
-      </w:r>
-    </w:p>
-    <w:p>
-      <w:pPr>
-        <w:pStyle w:val="Heading2"/>
-      </w:pPr>
-      <w:bookmarkStart w:id="32" w:name="_Toc243431156"/>
-      <w:r>
-        <w:t>C. Evidence map</w:t>
-      </w:r>
-      <w:bookmarkEnd w:id="32"/>
-    </w:p>
-    <w:p>
-      <w:pPr>
-        <w:pStyle w:val="ListBullet"/>
-      </w:pPr>
-      <w:r>
-        <w:t xml:space="preserve">New HTTP assertions/results: </w:t>
-      </w:r>
-      <w:r>
-        <w:rPr>
-          <w:rFonts w:ascii="Consolas" w:eastAsia="Consolas" w:hAnsi="Consolas" w:cs="Consolas"/>
-          <w:sz w:val="20"/>
-        </w:rPr>
-        <w:t>evidence/reviews/final-dashboard/http-workflow-20261020-1/</w:t>
-      </w:r>
-      <w:r>
-        <w:t>.</w:t>
-      </w:r>
-    </w:p>
-    <w:p>
-      <w:pPr>
-        <w:pStyle w:val="ListBullet"/>
-      </w:pPr>
-      <w:r>
-        <w:t xml:space="preserve">Actual browser assertions/screenshots: </w:t>
-      </w:r>
-      <w:r>
-        <w:rPr>
-          <w:rFonts w:ascii="Consolas" w:eastAsia="Consolas" w:hAnsi="Consolas" w:cs="Consolas"/>
-          <w:sz w:val="20"/>
-        </w:rPr>
-        <w:t>evidence/reviews/final-dashboard/browser-20261020-2/</w:t>
-      </w:r>
-      <w:r>
-        <w:t>.</w:t>
-      </w:r>
-    </w:p>
-    <w:p>
-      <w:pPr>
-        <w:pStyle w:val="ListBullet"/>
-      </w:pPr>
-      <w:r>
-        <w:t>Final six-invariant and cleanup records: see the dashboard implementation report.</w:t>
-      </w:r>
-    </w:p>
-    <w:p>
-      <w:pPr>
-        <w:pStyle w:val="ListBullet"/>
-      </w:pPr>
-      <w:r>
-        <w:t xml:space="preserve">Historical SQL/CLI summary: </w:t>
-      </w:r>
-      <w:r>
-        <w:rPr>
-          <w:rFonts w:ascii="Consolas" w:eastAsia="Consolas" w:hAnsi="Consolas" w:cs="Consolas"/>
-          <w:sz w:val="20"/>
-        </w:rPr>
-        <w:t>evidence/reviews/final-demo/REPORT.md</w:t>
-      </w:r>
-      <w:r>
-        <w:t>.</w:t>
-      </w:r>
-    </w:p>
-    <w:p>
-      <w:pPr>
-        <w:pStyle w:val="ListBullet"/>
-      </w:pPr>
-      <w:r>
-        <w:lastRenderedPageBreak/>
         <w:t xml:space="preserve">Historical performance/isolation/deadlock source: </w:t>
       </w:r>
       <w:r>
@@ -7594,32 +8477,39 @@
           <w:rFonts w:ascii="Consolas" w:eastAsia="Consolas" w:hAnsi="Consolas" w:cs="Consolas"/>
           <w:sz w:val="20"/>
         </w:rPr>
-        <w:t>docs/er/er_core.mmd</w:t>
-      </w:r>
-      <w:r>
-        <w:t>; live metadata adds the installed Account_Risk_Profile relation and all sixteen business tables.</w:t>
-      </w:r>
-    </w:p>
-    <w:p>
+        <w:t>docs/er/</w:t>
+      </w:r>
+      <w:proofErr w:type="spellStart"/>
       <w:r>
         <w:rPr>
-          <w:b/>
+          <w:rFonts w:ascii="Consolas" w:eastAsia="Consolas" w:hAnsi="Consolas" w:cs="Consolas"/>
+          <w:sz w:val="20"/>
         </w:rPr>
-        <w:t>Submission status:</w:t>
-      </w:r>
-      <w:r>
-        <w:t xml:space="preserve"> complete Markdown project report and working local dashboard; DOCX is optional/deferred. Fill only the institutional/student title fields before submission and retain the security/performance limitations.</w:t>
-      </w:r>
-    </w:p>
-    <w:p>
-      <w:pPr>
-        <w:pStyle w:val="Heading1"/>
-        <w:pageBreakBefore/>
-      </w:pPr>
+        <w:t>er_core.mmd</w:t>
+      </w:r>
+      <w:proofErr w:type="spellEnd"/>
+      <w:r>
+        <w:t xml:space="preserve">; live metadata adds the installed </w:t>
+      </w:r>
+      <w:proofErr w:type="spellStart"/>
+      <w:r>
+        <w:t>Account_Risk_Profile</w:t>
+      </w:r>
+      <w:proofErr w:type="spellEnd"/>
+      <w:r>
+        <w:t xml:space="preserve"> relation and all sixteen business </w:t>
+      </w:r>
+      <w:proofErr w:type="spellStart"/>
+      <w:r>
+        <w:t>tables.</w:t>
+      </w:r>
       <w:bookmarkStart w:id="33" w:name="_Toc243431157"/>
       <w:r>
-        <w:lastRenderedPageBreak/>
-        <w:t>Appendix: Additional System Screenshots</w:t>
+        <w:t>Appendix</w:t>
+      </w:r>
+      <w:proofErr w:type="spellEnd"/>
+      <w:r>
+        <w:t>: Additional System Screenshots</w:t>
       </w:r>
       <w:bookmarkEnd w:id="33"/>
     </w:p>
@@ -7634,6 +8524,7 @@
           <w:noProof/>
           <w:sz w:val="2"/>
         </w:rPr>
+        <w:lastRenderedPageBreak/>
         <w:drawing>
           <wp:inline distT="0" distB="0" distL="0" distR="0" wp14:anchorId="605E3271" wp14:editId="18C205C6">
             <wp:extent cx="4086934" cy="7543800"/>
@@ -8165,7 +9056,7 @@
   <w:abstractNum w:abstractNumId="8" w15:restartNumberingAfterBreak="0">
     <w:nsid w:val="FFFFFF89"/>
     <w:multiLevelType w:val="singleLevel"/>
-    <w:tmpl w:val="29761A62"/>
+    <w:tmpl w:val="C4CEA970"/>
     <w:lvl w:ilvl="0">
       <w:start w:val="1"/>
       <w:numFmt w:val="bullet"/>

</xml_diff>